<commit_message>
docs(tesis): completar figuras, tablas y validación con vulnerabilidades reales
- Figura 3 rehecha con el enlace entre archivos y las dos entradas
  (navegador y CLI). Nuevas: Figura 7 (versión web), Figura 8 (flujo de
  fondos) y Figura 9 (sensibilidad del VAN).
- Tabla 6 con las cuatro familias CWE (se suma CWE-943) y los conteos del
  catálogo actual; Tabla 7 con el banco de 43 casos; Tabla 9 con Web
  Workers y Vercel.
- Nueva Tabla 8: validación sobre 6 advisories de npm (1/6 detectado, sin
  discriminación), con su lectura; tablas siguientes renumeradas y listas
  de tablas y figuras actualizadas.
- Capítulo 4 alineado con el análisis entre archivos, la versión web y el
  CLI; referencias de los capítulos 4 y 5.
- docs/validacion: metodología y resultados de la validación con CVE.

Co-Authored-By: Claude Opus 5.5 <noreply@anthropic.com>
</commit_message>
<xml_diff>
--- a/docs/GraphSAST.docx
+++ b/docs/GraphSAST.docx
@@ -3494,7 +3494,7 @@
           <w:shd w:fill="auto" w:val="clear"/>
           <w:vertAlign w:val="baseline"/>
         </w:rPr>
-        <w:t>Tabla 7. Resultados del banco de pruebas sintético (14 casos)</w:t>
+        <w:t>Tabla 7. Resultados del banco de pruebas sintético (43 casos)</w:t>
       </w:r>
     </w:p>
     <w:p>
@@ -3546,7 +3546,7 @@
           <w:shd w:fill="auto" w:val="clear"/>
           <w:vertAlign w:val="baseline"/>
         </w:rPr>
-        <w:t>Tabla 8. Tecnologías empleadas en el desarrollo del prototipo</w:t>
+        <w:t xml:space="preserve">Tabla 8. Validación sobre vulnerabilidades documentadas del ecosistema npm (6 casos)</w:t>
       </w:r>
     </w:p>
     <w:p>
@@ -3598,7 +3598,7 @@
           <w:shd w:fill="auto" w:val="clear"/>
           <w:vertAlign w:val="baseline"/>
         </w:rPr>
-        <w:t>Tabla 9. Categorías de nodo del modelo de grafo</w:t>
+        <w:t>Tabla 9. Tecnologías empleadas en el desarrollo del prototipo</w:t>
       </w:r>
     </w:p>
     <w:p>
@@ -3650,7 +3650,7 @@
           <w:shd w:fill="auto" w:val="clear"/>
           <w:vertAlign w:val="baseline"/>
         </w:rPr>
-        <w:t>Tabla 10. Categorías de relación del modelo de grafo</w:t>
+        <w:t>Tabla 10. Categorías de nodo del modelo de grafo</w:t>
       </w:r>
     </w:p>
     <w:p>
@@ -3702,7 +3702,7 @@
           <w:shd w:fill="auto" w:val="clear"/>
           <w:vertAlign w:val="baseline"/>
         </w:rPr>
-        <w:t>Tabla 11. Supuestos de estimación de horas de desarrollo</w:t>
+        <w:t>Tabla 11. Categorías de relación del modelo de grafo</w:t>
       </w:r>
     </w:p>
     <w:p>
@@ -3754,7 +3754,7 @@
           <w:shd w:fill="auto" w:val="clear"/>
           <w:vertAlign w:val="baseline"/>
         </w:rPr>
-        <w:t>Tabla 12. Presupuesto de inversión inicial (Año 0)</w:t>
+        <w:t>Tabla 12. Supuestos de estimación de horas de desarrollo</w:t>
       </w:r>
     </w:p>
     <w:p>
@@ -3806,7 +3806,7 @@
           <w:shd w:fill="auto" w:val="clear"/>
           <w:vertAlign w:val="baseline"/>
         </w:rPr>
-        <w:t>Tabla 13. Costos operativos anuales post-proyecto, en dólares (Años 1 a 5)</w:t>
+        <w:t>Tabla 13. Presupuesto de inversión inicial (Año 0)</w:t>
       </w:r>
     </w:p>
     <w:p>
@@ -3858,7 +3858,7 @@
           <w:shd w:fill="auto" w:val="clear"/>
           <w:vertAlign w:val="baseline"/>
         </w:rPr>
-        <w:t>Tabla 14. Flujo de fondos proyectado, en dólares (Años 0 a 5)</w:t>
+        <w:t>Tabla 14. Costos operativos anuales post-proyecto, en dólares (Años 1 a 5)</w:t>
       </w:r>
     </w:p>
     <w:p>
@@ -3910,7 +3910,7 @@
           <w:shd w:fill="auto" w:val="clear"/>
           <w:vertAlign w:val="baseline"/>
         </w:rPr>
-        <w:t>Tabla 15. Resultados de los indicadores financieros</w:t>
+        <w:t>Tabla 15. Flujo de fondos proyectado, en dólares (Años 0 a 5)</w:t>
       </w:r>
     </w:p>
     <w:p>
@@ -3962,7 +3962,7 @@
           <w:shd w:fill="auto" w:val="clear"/>
           <w:vertAlign w:val="baseline"/>
         </w:rPr>
-        <w:t>Tabla 16. Sensibilidad del Valor Actual Neto frente a variaciones en la tasa de descuento</w:t>
+        <w:t>Tabla 16. Resultados de los indicadores financieros</w:t>
       </w:r>
     </w:p>
     <w:p>
@@ -4014,21 +4014,7 @@
           <w:shd w:fill="auto" w:val="clear"/>
           <w:vertAlign w:val="baseline"/>
         </w:rPr>
-        <w:t>Tabla 17. Evaluación de escenarios sobre la base de usuarios</w:t>
-      </w:r>
-    </w:p>
-    <w:p>
-      <w:pPr>
-        <w:pStyle w:val="Heading1"/>
-        <w:rPr/>
-      </w:pPr>
-      <w:bookmarkStart w:id="16" w:name="__RefHeading___Toc2703_3794039968"/>
-      <w:bookmarkStart w:id="17" w:name="_heading=h.3s3mu8p60mgw"/>
-      <w:bookmarkEnd w:id="16"/>
-      <w:bookmarkEnd w:id="17"/>
-      <w:r>
-        <w:rPr/>
-        <w:t>Lista de figuras</w:t>
+        <w:t>Tabla 17. Sensibilidad del Valor Actual Neto frente a variaciones en la tasa de descuento</w:t>
       </w:r>
     </w:p>
     <w:p>
@@ -4080,7 +4066,21 @@
           <w:shd w:fill="auto" w:val="clear"/>
           <w:vertAlign w:val="baseline"/>
         </w:rPr>
-        <w:t>Figura 1. Flujo general de procesamiento de GraphSAST: código fuente, parser, grafo de flujo de datos, consultas y visualización.</w:t>
+        <w:t>Tabla 18. Evaluación de escenarios sobre la base de usuarios</w:t>
+      </w:r>
+    </w:p>
+    <w:p>
+      <w:pPr>
+        <w:pStyle w:val="Heading1"/>
+        <w:rPr/>
+      </w:pPr>
+      <w:bookmarkStart w:id="16" w:name="__RefHeading___Toc2703_3794039968"/>
+      <w:bookmarkStart w:id="17" w:name="_heading=h.3s3mu8p60mgw"/>
+      <w:bookmarkEnd w:id="16"/>
+      <w:bookmarkEnd w:id="17"/>
+      <w:r>
+        <w:rPr/>
+        <w:t>Lista de figuras</w:t>
       </w:r>
     </w:p>
     <w:p>
@@ -4132,7 +4132,7 @@
           <w:shd w:fill="auto" w:val="clear"/>
           <w:vertAlign w:val="baseline"/>
         </w:rPr>
-        <w:t>Figura 2. Recorrido source-sink utilizado en el análisis de taint.</w:t>
+        <w:t>Figura 1. Flujo general de procesamiento de GraphSAST: código fuente, parser, grafo de flujo de datos, consultas y visualización.</w:t>
       </w:r>
     </w:p>
     <w:p>
@@ -4184,7 +4184,7 @@
           <w:shd w:fill="auto" w:val="clear"/>
           <w:vertAlign w:val="baseline"/>
         </w:rPr>
-        <w:t>Figura 3. Arquitectura de GraphSAST: pipeline de análisis por etapas, desde el código fuente hasta la visualización de los caminos de riesgo.</w:t>
+        <w:t>Figura 2. Recorrido source-sink utilizado en el análisis de taint.</w:t>
       </w:r>
     </w:p>
     <w:p>
@@ -4236,7 +4236,7 @@
           <w:shd w:fill="auto" w:val="clear"/>
           <w:vertAlign w:val="baseline"/>
         </w:rPr>
-        <w:t>Figura 4. Detección de vulnerabilidad (CWE-89): el dato fluye desde el parámetro de entrada hasta la operación de consulta sin saneamiento intermedio.</w:t>
+        <w:t>Figura 3. Arquitectura de GraphSAST: pipeline de análisis por etapas, desde los archivos del proyecto hasta la visualización y los reportes, con enlace entre archivos.</w:t>
       </w:r>
     </w:p>
     <w:p>
@@ -4288,7 +4288,7 @@
           <w:shd w:fill="auto" w:val="clear"/>
           <w:vertAlign w:val="baseline"/>
         </w:rPr>
-        <w:t>Figura 5. Caso saneado: el sistema identifica el origen y el destino sensible, pero descarta el hallazgo al constatar el saneamiento en el recorrido.</w:t>
+        <w:t>Figura 4. Detección de vulnerabilidad (CWE-89): el dato fluye desde el parámetro de entrada hasta la operación de consulta sin saneamiento intermedio.</w:t>
       </w:r>
     </w:p>
     <w:p>
@@ -4340,7 +4340,215 @@
           <w:shd w:fill="auto" w:val="clear"/>
           <w:vertAlign w:val="baseline"/>
         </w:rPr>
+        <w:t>Figura 5. Caso saneado: el sistema identifica el origen y el destino sensible, pero descarta el hallazgo al constatar el saneamiento en el recorrido.</w:t>
+      </w:r>
+    </w:p>
+    <w:p>
+      <w:pPr>
+        <w:pStyle w:val="normal1"/>
+        <w:keepNext w:val="false"/>
+        <w:keepLines w:val="false"/>
+        <w:pageBreakBefore w:val="false"/>
+        <w:widowControl/>
+        <w:pBdr/>
+        <w:spacing w:lineRule="auto" w:line="240" w:before="0" w:after="0"/>
+        <w:ind w:hanging="0" w:left="0" w:right="0"/>
+        <w:jc w:val="left"/>
+        <w:rPr>
+          <w:rFonts w:ascii="Arial" w:hAnsi="Arial" w:eastAsia="Arial" w:cs="Arial"/>
+          <w:b w:val="false"/>
+          <w:bCs w:val="false"/>
+          <w:i w:val="false"/>
+          <w:iCs w:val="false"/>
+          <w:caps w:val="false"/>
+          <w:smallCaps w:val="false"/>
+          <w:strike w:val="false"/>
+          <w:dstrike w:val="false"/>
+          <w:color w:val="222222"/>
+          <w:position w:val="0"/>
+          <w:sz w:val="22"/>
+          <w:szCs w:val="22"/>
+          <w:u w:val="none"/>
+          <w:shd w:fill="auto" w:val="clear"/>
+          <w:vertAlign w:val="baseline"/>
+        </w:rPr>
+      </w:pPr>
+      <w:r>
+        <w:rPr>
+          <w:rFonts w:eastAsia="Arial" w:cs="Arial"/>
+          <w:b w:val="false"/>
+          <w:bCs w:val="false"/>
+          <w:i w:val="false"/>
+          <w:iCs w:val="false"/>
+          <w:caps w:val="false"/>
+          <w:smallCaps w:val="false"/>
+          <w:strike w:val="false"/>
+          <w:dstrike w:val="false"/>
+          <w:color w:val="222222"/>
+          <w:position w:val="0"/>
+          <w:sz w:val="22"/>
+          <w:szCs w:val="22"/>
+          <w:u w:val="none"/>
+          <w:shd w:fill="auto" w:val="clear"/>
+          <w:vertAlign w:val="baseline"/>
+        </w:rPr>
         <w:t>Figura 6. Panel de métricas y líneas del camino de riesgo correspondientes al análisis ejecutado.</w:t>
+      </w:r>
+    </w:p>
+    <w:p>
+      <w:pPr>
+        <w:pStyle w:val="normal1"/>
+        <w:keepNext w:val="false"/>
+        <w:keepLines w:val="false"/>
+        <w:pageBreakBefore w:val="false"/>
+        <w:widowControl/>
+        <w:pBdr/>
+        <w:spacing w:lineRule="auto" w:line="240" w:before="0" w:after="0"/>
+        <w:ind w:hanging="0" w:left="0" w:right="0"/>
+        <w:jc w:val="left"/>
+        <w:rPr>
+          <w:rFonts w:ascii="Arial" w:hAnsi="Arial" w:eastAsia="Arial" w:cs="Arial"/>
+          <w:b w:val="false"/>
+          <w:bCs w:val="false"/>
+          <w:i w:val="false"/>
+          <w:iCs w:val="false"/>
+          <w:caps w:val="false"/>
+          <w:smallCaps w:val="false"/>
+          <w:strike w:val="false"/>
+          <w:dstrike w:val="false"/>
+          <w:color w:val="222222"/>
+          <w:position w:val="0"/>
+          <w:sz w:val="22"/>
+          <w:szCs w:val="22"/>
+          <w:u w:val="none"/>
+          <w:shd w:fill="auto" w:val="clear"/>
+          <w:vertAlign w:val="baseline"/>
+        </w:rPr>
+      </w:pPr>
+      <w:r>
+        <w:rPr>
+          <w:rFonts w:eastAsia="Arial" w:cs="Arial"/>
+          <w:b w:val="false"/>
+          <w:bCs w:val="false"/>
+          <w:i w:val="false"/>
+          <w:iCs w:val="false"/>
+          <w:caps w:val="false"/>
+          <w:smallCaps w:val="false"/>
+          <w:strike w:val="false"/>
+          <w:dstrike w:val="false"/>
+          <w:color w:val="222222"/>
+          <w:position w:val="0"/>
+          <w:sz w:val="22"/>
+          <w:szCs w:val="22"/>
+          <w:u w:val="none"/>
+          <w:shd w:fill="auto" w:val="clear"/>
+          <w:vertAlign w:val="baseline"/>
+        </w:rPr>
+        <w:t xml:space="preserve">Figura 7. Versión web: análisis de un proyecto subido como carpeta. El hallazgo cruza tres archivos y se muestra el archivo del sink con las líneas del camino resaltadas.</w:t>
+      </w:r>
+    </w:p>
+    <w:p>
+      <w:pPr>
+        <w:pStyle w:val="normal1"/>
+        <w:keepNext w:val="false"/>
+        <w:keepLines w:val="false"/>
+        <w:pageBreakBefore w:val="false"/>
+        <w:widowControl/>
+        <w:pBdr/>
+        <w:spacing w:lineRule="auto" w:line="240" w:before="0" w:after="0"/>
+        <w:ind w:hanging="0" w:left="0" w:right="0"/>
+        <w:jc w:val="left"/>
+        <w:rPr>
+          <w:rFonts w:ascii="Arial" w:hAnsi="Arial" w:eastAsia="Arial" w:cs="Arial"/>
+          <w:b w:val="false"/>
+          <w:bCs w:val="false"/>
+          <w:i w:val="false"/>
+          <w:iCs w:val="false"/>
+          <w:caps w:val="false"/>
+          <w:smallCaps w:val="false"/>
+          <w:strike w:val="false"/>
+          <w:dstrike w:val="false"/>
+          <w:color w:val="222222"/>
+          <w:position w:val="0"/>
+          <w:sz w:val="22"/>
+          <w:szCs w:val="22"/>
+          <w:u w:val="none"/>
+          <w:shd w:fill="auto" w:val="clear"/>
+          <w:vertAlign w:val="baseline"/>
+        </w:rPr>
+      </w:pPr>
+      <w:r>
+        <w:rPr>
+          <w:rFonts w:eastAsia="Arial" w:cs="Arial"/>
+          <w:b w:val="false"/>
+          <w:bCs w:val="false"/>
+          <w:i w:val="false"/>
+          <w:iCs w:val="false"/>
+          <w:caps w:val="false"/>
+          <w:smallCaps w:val="false"/>
+          <w:strike w:val="false"/>
+          <w:dstrike w:val="false"/>
+          <w:color w:val="222222"/>
+          <w:position w:val="0"/>
+          <w:sz w:val="22"/>
+          <w:szCs w:val="22"/>
+          <w:u w:val="none"/>
+          <w:shd w:fill="auto" w:val="clear"/>
+          <w:vertAlign w:val="baseline"/>
+        </w:rPr>
+        <w:t xml:space="preserve">Figura 8. Flujo de fondos neto y acumulado, en dólares (Años 0 a 5). El acumulado se vuelve positivo a los 1,94 años.</w:t>
+      </w:r>
+    </w:p>
+    <w:p>
+      <w:pPr>
+        <w:pStyle w:val="normal1"/>
+        <w:keepNext w:val="false"/>
+        <w:keepLines w:val="false"/>
+        <w:pageBreakBefore w:val="false"/>
+        <w:widowControl/>
+        <w:pBdr/>
+        <w:spacing w:lineRule="auto" w:line="240" w:before="0" w:after="0"/>
+        <w:ind w:hanging="0" w:left="0" w:right="0"/>
+        <w:jc w:val="left"/>
+        <w:rPr>
+          <w:rFonts w:ascii="Arial" w:hAnsi="Arial" w:eastAsia="Arial" w:cs="Arial"/>
+          <w:b w:val="false"/>
+          <w:bCs w:val="false"/>
+          <w:i w:val="false"/>
+          <w:iCs w:val="false"/>
+          <w:caps w:val="false"/>
+          <w:smallCaps w:val="false"/>
+          <w:strike w:val="false"/>
+          <w:dstrike w:val="false"/>
+          <w:color w:val="222222"/>
+          <w:position w:val="0"/>
+          <w:sz w:val="22"/>
+          <w:szCs w:val="22"/>
+          <w:u w:val="none"/>
+          <w:shd w:fill="auto" w:val="clear"/>
+          <w:vertAlign w:val="baseline"/>
+        </w:rPr>
+      </w:pPr>
+      <w:r>
+        <w:rPr>
+          <w:rFonts w:eastAsia="Arial" w:cs="Arial"/>
+          <w:b w:val="false"/>
+          <w:bCs w:val="false"/>
+          <w:i w:val="false"/>
+          <w:iCs w:val="false"/>
+          <w:caps w:val="false"/>
+          <w:smallCaps w:val="false"/>
+          <w:strike w:val="false"/>
+          <w:dstrike w:val="false"/>
+          <w:color w:val="222222"/>
+          <w:position w:val="0"/>
+          <w:sz w:val="22"/>
+          <w:szCs w:val="22"/>
+          <w:u w:val="none"/>
+          <w:shd w:fill="auto" w:val="clear"/>
+          <w:vertAlign w:val="baseline"/>
+        </w:rPr>
+        <w:t xml:space="preserve">Figura 9. Valor Actual Neto según la tasa de descuento anual.</w:t>
       </w:r>
     </w:p>
     <w:p>
@@ -10688,7 +10896,7 @@
       </w:pPr>
       <w:r>
         <w:rPr/>
-        <w:t>El proyecto se organiza como un monorepo gestionado mediante espacios de trabajo de npm, compuesto por dos paquetes con responsabilidades diferenciadas. El paquete de núcleo concentra la totalidad del motor de análisis: análisis sintáctico, construcción de la representación intermedia, generación del grafo y detección de recorridos vulnerables. El paquete de visualización implementa la interfaz web y consume los resultados producidos por el núcleo. Esta separación permite que el motor de análisis opere de manera independiente de cualquier interfaz gráfica.</w:t>
+        <w:t>El proyecto se organiza como un monorepo gestionado mediante espacios de trabajo de npm, compuesto por dos paquetes con responsabilidades diferenciadas. El paquete de núcleo concentra la totalidad del motor de análisis: análisis sintáctico, construcción de la representación intermedia, generación del grafo y detección de recorridos vulnerables. El paquete de visualización implementa la interfaz web y consume los resultados producidos por el núcleo, que expone además un punto de entrada sin dependencias de Node.js para ejecutar el mismo motor en el navegador. Esta separación permite que el motor de análisis opere de manera independiente de cualquier interfaz gráfica.</w:t>
       </w:r>
     </w:p>
     <w:p>
@@ -10712,7 +10920,7 @@
       </w:pPr>
       <w:r>
         <w:rPr/>
-        <w:t>El procesamiento se inicia con el código fuente ingresado por el usuario, que es transformado en un árbol de sintaxis abstracta. A partir de dicho árbol se construye una representación intermedia compuesta por nodos tipados. Sobre esa representación operan tres constructores de aristas que se ejecutan de manera independiente sobre el mismo conjunto de nodos: el generador del grafo de llamadas, el analizador de flujo de datos intra-procedural y el analizador de flujo inter-procedural. La unión de los nodos y de las aristas producidas por los tres constructores conforma el grafo dirigido que constituye la representación central del programa. Sobre dicho grafo opera el motor de análisis de contaminación, cuyos resultados se transfieren finalmente al módulo de visualización.</w:t>
+        <w:t>El procesamiento se inicia con los archivos fuente que el usuario selecciona en la versión web o indica en la interfaz de línea de comandos. Cada archivo es transformado en un árbol de sintaxis abstracta. A partir de dicho árbol se construye una representación intermedia compuesta por nodos tipados. Sobre esa representación operan tres constructores de aristas que se ejecutan de manera independiente sobre el mismo conjunto de nodos: el generador del grafo de llamadas, el analizador de flujo de datos intra-procedural y el analizador de flujo inter-procedural. La unión de los nodos y de las aristas producidas por los tres constructores conforma el grafo dirigido que constituye la representación central del programa. A continuación, la etapa de enlace entre archivos resuelve las llamadas a funciones importadas desde otros archivos del proyecto y agrega las aristas de invocación y de asociación de argumentos correspondientes, de modo que los grafos de los archivos conectados por llamadas se unen en un único grafo. Sobre dicho grafo opera el motor de análisis de contaminación, cuyos resultados se presentan en el módulo de visualización o en los reportes de la interfaz de línea de comandos.</w:t>
       </w:r>
     </w:p>
     <w:p>
@@ -10726,7 +10934,7 @@
         <w:rPr/>
         <w:drawing>
           <wp:inline distT="0" distB="0" distL="0" distR="0">
-            <wp:extent cx="4572000" cy="4314825"/>
+            <wp:extent cx="4572000" cy="4967416"/>
             <wp:effectExtent l="0" t="0" r="0" b="0"/>
             <wp:docPr id="4" name="Figura 101"/>
             <wp:cNvGraphicFramePr>
@@ -10750,7 +10958,7 @@
                   <pic:spPr bwMode="auto">
                     <a:xfrm>
                       <a:off x="0" y="0"/>
-                      <a:ext cx="4572000" cy="4314825"/>
+                      <a:ext cx="4572000" cy="4967416"/>
                     </a:xfrm>
                     <a:prstGeom prst="rect">
                       <a:avLst/>
@@ -10785,7 +10993,7 @@
           <w:sz w:val="18"/>
           <w:szCs w:val="18"/>
         </w:rPr>
-        <w:t>Figura 3. Arquitectura de GraphSAST: pipeline de análisis por etapas, desde el código fuente hasta la visualización de los caminos de riesgo.</w:t>
+        <w:t>Figura 3. Arquitectura de GraphSAST: pipeline de análisis por etapas, desde los archivos del proyecto hasta la visualización y los reportes, con enlace entre archivos.</w:t>
       </w:r>
     </w:p>
     <w:p>
@@ -10846,7 +11054,7 @@
       </w:pPr>
       <w:r>
         <w:rPr/>
-        <w:t>El prototipo ejecuta el pipeline completo de análisis sobre el código ingresado: análisis sintáctico, construcción de la representación intermedia, generación del grafo de llamadas, análisis de flujo de datos intra e inter-procedural, y detección de recorridos desde puntos de entrada hacia operaciones sensibles sin saneamiento intermedio. La detección se resuelve mediante dos motores intercambiables: un recorrido en anchura sobre el grafo en memoria, empleado por defecto, y una consulta declarativa en Cypher ejecutada sobre el grafo persistido en Neo4j, que descarta los caminos que atraviesan un nodo de saneamiento y acota la profundidad de búsqueda. Los resultados se presentan mediante visualización interactiva del grafo, con resaltado del camino de riesgo y vinculación con las líneas de código correspondientes. El sistema admite además la exportación del informe de análisis en formato JSON, HTML y PDF.</w:t>
+        <w:t>El prototipo ejecuta el pipeline completo de análisis sobre los archivos de un proyecto: análisis sintáctico, construcción de la representación intermedia, generación del grafo de llamadas, análisis de flujo de datos intra e inter-procedural, y detección de recorridos desde puntos de entrada hacia operaciones sensibles sin saneamiento intermedio. La detección se resuelve mediante dos motores intercambiables: un recorrido en anchura sobre el grafo en memoria, empleado por defecto, y una consulta declarativa en Cypher ejecutada sobre el grafo persistido en Neo4j, que descarta los caminos que atraviesan un nodo de saneamiento y acota la profundidad de búsqueda. Los resultados se presentan mediante visualización interactiva del grafo, con resaltado del camino de riesgo y vinculación con las líneas de código correspondientes. El sistema admite además la exportación del informe de análisis en formato JSON, HTML y PDF. El análisis sigue el dato de un archivo a otro cuando una función importada desde otro archivo del proyecto lo recibe como argumento. La versión web analiza una carpeta o un conjunto de archivos elegidos por el usuario, y la interfaz de línea de comandos analiza rutas del disco, emite reportes en texto, JSON y SARIF, y devuelve códigos de salida que permiten detener un pipeline de integración continua cuando se detectan hallazgos.</w:t>
       </w:r>
     </w:p>
     <w:p>
@@ -10870,7 +11078,7 @@
       </w:pPr>
       <w:r>
         <w:rPr/>
-        <w:t>Se implementaron las tres debilidades definidas en el diseño arquitectónico, seleccionadas por constituir la tríada canónica del análisis de contaminación y por integrar el listado de debilidades más críticas publicado por MITRE:</w:t>
+        <w:t>Se implementaron las tres debilidades definidas en el diseño arquitectónico, seleccionadas por constituir la tríada canónica del análisis de contaminación y por integrar el listado de debilidades más críticas publicado por MITRE, a las que se sumó la inyección NoSQL (CWE-943), habitual en aplicaciones Node.js que emplean bases de datos documentales como MongoDB:</w:t>
       </w:r>
     </w:p>
     <w:tbl>
@@ -11130,7 +11338,7 @@
                 <w:sz w:val="18"/>
                 <w:szCs w:val="18"/>
               </w:rPr>
-              <w:t>11</w:t>
+              <w:t xml:space="preserve">5</w:t>
             </w:r>
           </w:p>
         </w:tc>
@@ -11161,7 +11369,7 @@
                 <w:sz w:val="18"/>
                 <w:szCs w:val="18"/>
               </w:rPr>
-              <w:t>5</w:t>
+              <w:t xml:space="preserve">5</w:t>
             </w:r>
           </w:p>
         </w:tc>
@@ -11392,7 +11600,7 @@
                 <w:sz w:val="18"/>
                 <w:szCs w:val="18"/>
               </w:rPr>
-              <w:t>5</w:t>
+              <w:t xml:space="preserve">6</w:t>
             </w:r>
           </w:p>
         </w:tc>
@@ -11423,7 +11631,138 @@
                 <w:sz w:val="18"/>
                 <w:szCs w:val="18"/>
               </w:rPr>
-              <w:t>5</w:t>
+              <w:t xml:space="preserve">5</w:t>
+            </w:r>
+          </w:p>
+        </w:tc>
+      </w:tr>
+      <w:tr>
+        <w:trPr/>
+        <w:tc>
+          <w:tcPr>
+            <w:tcW w:w="1400" w:type="dxa"/>
+            <w:tcBorders>
+              <w:top w:val="single" w:sz="4" w:space="0" w:color="CCCCCC"/>
+              <w:left w:val="single" w:sz="4" w:space="0" w:color="CCCCCC"/>
+              <w:bottom w:val="single" w:sz="4" w:space="0" w:color="CCCCCC"/>
+              <w:right w:val="single" w:sz="4" w:space="0" w:color="CCCCCC"/>
+            </w:tcBorders>
+            <w:shd w:fill="EAF1F8" w:val="clear"/>
+          </w:tcPr>
+          <w:p>
+            <w:pPr>
+              <w:pStyle w:val="normal1"/>
+              <w:spacing w:lineRule="auto" w:line="240" w:before="0" w:after="0"/>
+              <w:rPr>
+                <w:b/>
+                <w:bCs/>
+                <w:color w:val="1F3A5F"/>
+                <w:sz w:val="18"/>
+                <w:szCs w:val="18"/>
+              </w:rPr>
+            </w:pPr>
+            <w:r>
+              <w:rPr>
+                <w:b/>
+                <w:bCs/>
+                <w:color w:val="1F3A5F"/>
+                <w:sz w:val="18"/>
+                <w:szCs w:val="18"/>
+              </w:rPr>
+              <w:t xml:space="preserve">CWE-943</w:t>
+            </w:r>
+          </w:p>
+        </w:tc>
+        <w:tc>
+          <w:tcPr>
+            <w:tcW w:w="4759" w:type="dxa"/>
+            <w:tcBorders>
+              <w:top w:val="single" w:sz="4" w:space="0" w:color="CCCCCC"/>
+              <w:left w:val="single" w:sz="4" w:space="0" w:color="CCCCCC"/>
+              <w:bottom w:val="single" w:sz="4" w:space="0" w:color="CCCCCC"/>
+              <w:right w:val="single" w:sz="4" w:space="0" w:color="CCCCCC"/>
+            </w:tcBorders>
+            <w:shd w:fill="FFFFFF" w:val="clear"/>
+          </w:tcPr>
+          <w:p>
+            <w:pPr>
+              <w:pStyle w:val="normal1"/>
+              <w:spacing w:lineRule="auto" w:line="240" w:before="0" w:after="0"/>
+              <w:rPr>
+                <w:color w:val="222222"/>
+                <w:sz w:val="18"/>
+                <w:szCs w:val="18"/>
+              </w:rPr>
+            </w:pPr>
+            <w:r>
+              <w:rPr>
+                <w:color w:val="222222"/>
+                <w:sz w:val="18"/>
+                <w:szCs w:val="18"/>
+              </w:rPr>
+              <w:t xml:space="preserve">Inyección NoSQL</w:t>
+            </w:r>
+          </w:p>
+        </w:tc>
+        <w:tc>
+          <w:tcPr>
+            <w:tcW w:w="1601" w:type="dxa"/>
+            <w:tcBorders>
+              <w:top w:val="single" w:sz="4" w:space="0" w:color="CCCCCC"/>
+              <w:left w:val="single" w:sz="4" w:space="0" w:color="CCCCCC"/>
+              <w:bottom w:val="single" w:sz="4" w:space="0" w:color="CCCCCC"/>
+              <w:right w:val="single" w:sz="4" w:space="0" w:color="CCCCCC"/>
+            </w:tcBorders>
+            <w:shd w:fill="FFFFFF" w:val="clear"/>
+          </w:tcPr>
+          <w:p>
+            <w:pPr>
+              <w:pStyle w:val="normal1"/>
+              <w:spacing w:lineRule="auto" w:line="240" w:before="0" w:after="0"/>
+              <w:rPr>
+                <w:color w:val="222222"/>
+                <w:sz w:val="18"/>
+                <w:szCs w:val="18"/>
+              </w:rPr>
+            </w:pPr>
+            <w:r>
+              <w:rPr>
+                <w:color w:val="222222"/>
+                <w:sz w:val="18"/>
+                <w:szCs w:val="18"/>
+              </w:rPr>
+              <w:t xml:space="preserve">6</w:t>
+            </w:r>
+          </w:p>
+        </w:tc>
+        <w:tc>
+          <w:tcPr>
+            <w:tcW w:w="1600" w:type="dxa"/>
+            <w:tcBorders>
+              <w:top w:val="single" w:sz="4" w:space="0" w:color="CCCCCC"/>
+              <w:left w:val="single" w:sz="4" w:space="0" w:color="CCCCCC"/>
+              <w:bottom w:val="single" w:sz="4" w:space="0" w:color="CCCCCC"/>
+              <w:right w:val="single" w:sz="4" w:space="0" w:color="CCCCCC"/>
+            </w:tcBorders>
+            <w:shd w:fill="FFFFFF" w:val="clear"/>
+          </w:tcPr>
+          <w:p>
+            <w:pPr>
+              <w:pStyle w:val="normal1"/>
+              <w:spacing w:lineRule="auto" w:line="240" w:before="0" w:after="0"/>
+              <w:rPr>
+                <w:color w:val="222222"/>
+                <w:sz w:val="18"/>
+                <w:szCs w:val="18"/>
+              </w:rPr>
+            </w:pPr>
+            <w:r>
+              <w:rPr>
+                <w:color w:val="222222"/>
+                <w:sz w:val="18"/>
+                <w:szCs w:val="18"/>
+              </w:rPr>
+              <w:t xml:space="preserve">4</w:t>
             </w:r>
           </w:p>
         </w:tc>
@@ -11496,7 +11835,7 @@
       </w:pPr>
       <w:r>
         <w:rPr/>
-        <w:t>El desarrollo cuenta con una suite de pruebas automatizadas organizadas según la etapa del pipeline que verifican, lo que permite validar cada componente de forma aislada. La aplicación incorpora asimismo diez casos de demostración precargados que cubren escenarios contrastantes: flujo vulnerable dentro de una misma función, flujo vulnerable que cruza funciones, flujo correctamente saneado, operación sensible alcanzada por un literal constante, entradas de Express (req.body, req.params), inyección de comandos mediante eval y XSS por escritura sobre el documento.</w:t>
+        <w:t>El desarrollo cuenta con una suite de pruebas automatizadas organizadas según la etapa del pipeline que verifican, lo que permite validar cada componente de forma aislada. La aplicación incorpora asimismo quince casos de demostración precargados que cubren escenarios contrastantes: flujo vulnerable dentro de una misma función, flujo vulnerable que cruza funciones, flujo correctamente saneado, operación sensible alcanzada por un literal constante, entradas de Express (req.body, req.params), inyección de comandos mediante eval y XSS por escritura sobre el documento.</w:t>
       </w:r>
     </w:p>
     <w:p>
@@ -11763,7 +12102,7 @@
       </w:pPr>
       <w:r>
         <w:rPr/>
-        <w:t>La evaluación cuantitativa se ejecuta sobre un banco de pruebas etiquetado y reproducible desde la línea de comandos, integrado por catorce casos de verdad conocida —diez vulnerables y cuatro seguros— que cubren recorridos intra e inter-procedurales, casos saneados, operaciones sensibles alcanzadas por literales constantes y entradas propias de Express. Además de las tres debilidades del catálogo, el banco incorpora casos de validación insuficiente de la entrada (CWE-20) que alcanzan operaciones sensibles ya catalogadas. Cada caso se clasifica de forma binaria según el sistema emita o no hallazgos, lo que permite construir la matriz de confusión y derivar los indicadores definidos en el Capítulo 2.</w:t>
+        <w:t>La evaluación cuantitativa se ejecuta sobre un banco de pruebas etiquetado y reproducible desde la línea de comandos, integrado por cuarenta y tres casos de verdad conocida (veintinueve vulnerables y catorce seguros) que cubren recorridos intra e inter-procedurales, casos saneados, operaciones sensibles alcanzadas por literales constantes y entradas propias de Express. Además de las tres debilidades del catálogo, el banco incorpora casos de validación insuficiente de la entrada (CWE-20) que alcanzan operaciones sensibles ya catalogadas. Cada caso se clasifica de forma binaria según el sistema emita o no hallazgos, lo que permite construir la matriz de confusión y derivar los indicadores definidos en el Capítulo 2.</w:t>
       </w:r>
     </w:p>
     <w:p>
@@ -11930,7 +12269,7 @@
                 <w:sz w:val="18"/>
                 <w:szCs w:val="18"/>
               </w:rPr>
-              <w:t>10</w:t>
+              <w:t xml:space="preserve">29</w:t>
             </w:r>
           </w:p>
         </w:tc>
@@ -12068,7 +12407,7 @@
                 <w:sz w:val="18"/>
                 <w:szCs w:val="18"/>
               </w:rPr>
-              <w:t>4</w:t>
+              <w:t xml:space="preserve">14</w:t>
             </w:r>
           </w:p>
         </w:tc>
@@ -12413,7 +12752,7 @@
                 <w:sz w:val="18"/>
                 <w:szCs w:val="18"/>
               </w:rPr>
-              <w:t>41 ms</w:t>
+              <w:t xml:space="preserve">52 ms</w:t>
             </w:r>
           </w:p>
         </w:tc>
@@ -12482,7 +12821,7 @@
                 <w:sz w:val="18"/>
                 <w:szCs w:val="18"/>
               </w:rPr>
-              <w:t>0,64 ms</w:t>
+              <w:t xml:space="preserve">0,27 ms</w:t>
             </w:r>
           </w:p>
         </w:tc>
@@ -12519,7 +12858,7 @@
           <w:sz w:val="18"/>
           <w:szCs w:val="18"/>
         </w:rPr>
-        <w:t>Tabla 7. Resultados del banco de pruebas sintético (14 casos).</w:t>
+        <w:t>Tabla 7. Resultados del banco de pruebas sintético (43 casos; tiempos: mediana de cinco ejecuciones).</w:t>
       </w:r>
     </w:p>
     <w:p>
@@ -12531,7 +12870,1260 @@
       </w:pPr>
       <w:r>
         <w:rPr/>
-        <w:t>Corresponde delimitar el alcance de estos valores. Se obtienen sobre un corpus sintético reducido, construido por el propio autor y acotado a las construcciones sintácticas que el analizador cubre, por lo que no constituyen evidencia de desempeño sobre proyectos reales ni admiten generalización. Su función en esta instancia es la de una prueba de regresión que verifica que el motor no emite alertas sobre los casos correctamente saneados ni omite los recorridos vulnerables conocidos. La validación frente a repositorios con vulnerabilidades documentadas y la comparación cuantitativa con una herramienta de referencia, previstas en el diseño de investigación del Capítulo 2, permanecen pendientes.</w:t>
+        <w:t>Corresponde delimitar el alcance de estos valores. Se obtienen sobre un corpus sintético reducido, construido por el propio autor y acotado a las construcciones sintácticas que el analizador cubre, por lo que no constituyen evidencia de desempeño sobre proyectos reales ni admiten generalización. Su función en esta instancia es la de una prueba de regresión que verifica que el motor no emite alertas sobre los casos correctamente saneados ni omite los recorridos vulnerables conocidos. La comparación cuantitativa con una herramienta de referencia, prevista en el diseño de investigación del Capítulo 2, permanece pendiente. La validación frente a vulnerabilidades documentadas se presenta a continuación.</w:t>
+      </w:r>
+    </w:p>
+    <w:p>
+      <w:pPr>
+        <w:pStyle w:val="normal1"/>
+        <w:spacing w:lineRule="auto" w:line="276" w:before="0" w:after="150"/>
+        <w:jc w:val="both"/>
+        <w:rPr/>
+      </w:pPr>
+      <w:r>
+        <w:rPr/>
+        <w:t xml:space="preserve">Para contrastar el sistema con vulnerabilidades reales se empleó un corpus de seis advisories del ecosistema npm publicados en la base de datos de advisories de GitHub, relevados el 1 de septiembre de 2026 y congelados para que la medición resulte reproducible, restringidos a las debilidades del catálogo. Para cada caso se descargan del registro de npm la versión vulnerable del paquete y la versión que corrige la falla, se analizan ambas contando solo los hallazgos de la debilidad del advisory y se registran dos resultados: si la versión vulnerable presenta hallazgos (detección) y si la corrección del mantenedor reduce su cantidad (discriminación). La discriminación constituye la evidencia fuerte, dado que indica que el hallazgo se vincula con la vulnerabilidad y no con un patrón presente en todo el paquete.</w:t>
+      </w:r>
+    </w:p>
+    <w:tbl>
+      <w:tblPr>
+        <w:tblW w:w="9360" w:type="dxa"/>
+        <w:tblBorders>
+          <w:top w:val="single" w:sz="4" w:color="CCCCCC"/>
+          <w:left w:val="single" w:sz="4" w:color="CCCCCC"/>
+          <w:bottom w:val="single" w:sz="4" w:color="CCCCCC"/>
+          <w:right w:val="single" w:sz="4" w:color="CCCCCC"/>
+          <w:insideH w:val="single" w:sz="4" w:color="CCCCCC"/>
+          <w:insideV w:val="single" w:sz="4" w:color="CCCCCC"/>
+        </w:tblBorders>
+      </w:tblPr>
+      <w:tblGrid>
+        <w:gridCol w:w="3160"/>
+        <w:gridCol w:w="1240"/>
+        <w:gridCol w:w="1240"/>
+        <w:gridCol w:w="1240"/>
+        <w:gridCol w:w="1240"/>
+        <w:gridCol w:w="1240"/>
+      </w:tblGrid>
+      <w:tr>
+        <w:tc>
+          <w:tcPr>
+            <w:tcW w:w="3160" w:type="dxa"/>
+            <w:shd w:val="clear" w:color="auto" w:fill="1F3A5F"/>
+            <w:tcMar>
+              <w:top w:w="60" w:type="dxa"/>
+              <w:left w:w="100" w:type="dxa"/>
+              <w:bottom w:w="60" w:type="dxa"/>
+              <w:right w:w="100" w:type="dxa"/>
+            </w:tcMar>
+          </w:tcPr>
+          <w:p>
+            <w:pPr>
+              <w:spacing w:after="0" w:line="240" w:lineRule="auto"/>
+              <w:rPr/>
+            </w:pPr>
+            <w:r>
+              <w:rPr>
+                <w:b/>
+                <w:bCs/>
+                <w:color w:val="FFFFFF"/>
+                <w:sz w:val="18"/>
+                <w:szCs w:val="18"/>
+                <w:rtl w:val="0"/>
+              </w:rPr>
+              <w:t xml:space="preserve">Paquete (vulnerable → corregida)</w:t>
+            </w:r>
+          </w:p>
+        </w:tc>
+        <w:tc>
+          <w:tcPr>
+            <w:tcW w:w="1240" w:type="dxa"/>
+            <w:shd w:val="clear" w:color="auto" w:fill="1F3A5F"/>
+            <w:tcMar>
+              <w:top w:w="60" w:type="dxa"/>
+              <w:left w:w="100" w:type="dxa"/>
+              <w:bottom w:w="60" w:type="dxa"/>
+              <w:right w:w="100" w:type="dxa"/>
+            </w:tcMar>
+          </w:tcPr>
+          <w:p>
+            <w:pPr>
+              <w:spacing w:after="0" w:line="240" w:lineRule="auto"/>
+              <w:rPr/>
+            </w:pPr>
+            <w:r>
+              <w:rPr>
+                <w:b/>
+                <w:bCs/>
+                <w:color w:val="FFFFFF"/>
+                <w:sz w:val="18"/>
+                <w:szCs w:val="18"/>
+                <w:rtl w:val="0"/>
+              </w:rPr>
+              <w:t xml:space="preserve">CWE</w:t>
+            </w:r>
+          </w:p>
+        </w:tc>
+        <w:tc>
+          <w:tcPr>
+            <w:tcW w:w="1240" w:type="dxa"/>
+            <w:shd w:val="clear" w:color="auto" w:fill="1F3A5F"/>
+            <w:tcMar>
+              <w:top w:w="60" w:type="dxa"/>
+              <w:left w:w="100" w:type="dxa"/>
+              <w:bottom w:w="60" w:type="dxa"/>
+              <w:right w:w="100" w:type="dxa"/>
+            </w:tcMar>
+          </w:tcPr>
+          <w:p>
+            <w:pPr>
+              <w:spacing w:after="0" w:line="240" w:lineRule="auto"/>
+              <w:rPr/>
+            </w:pPr>
+            <w:r>
+              <w:rPr>
+                <w:b/>
+                <w:bCs/>
+                <w:color w:val="FFFFFF"/>
+                <w:sz w:val="18"/>
+                <w:szCs w:val="18"/>
+                <w:rtl w:val="0"/>
+              </w:rPr>
+              <w:t xml:space="preserve">Advisory</w:t>
+            </w:r>
+          </w:p>
+        </w:tc>
+        <w:tc>
+          <w:tcPr>
+            <w:tcW w:w="1240" w:type="dxa"/>
+            <w:shd w:val="clear" w:color="auto" w:fill="1F3A5F"/>
+            <w:tcMar>
+              <w:top w:w="60" w:type="dxa"/>
+              <w:left w:w="100" w:type="dxa"/>
+              <w:bottom w:w="60" w:type="dxa"/>
+              <w:right w:w="100" w:type="dxa"/>
+            </w:tcMar>
+          </w:tcPr>
+          <w:p>
+            <w:pPr>
+              <w:spacing w:after="0" w:line="240" w:lineRule="auto"/>
+              <w:rPr/>
+            </w:pPr>
+            <w:r>
+              <w:rPr>
+                <w:b/>
+                <w:bCs/>
+                <w:color w:val="FFFFFF"/>
+                <w:sz w:val="18"/>
+                <w:szCs w:val="18"/>
+                <w:rtl w:val="0"/>
+              </w:rPr>
+              <w:t xml:space="preserve">Archivos analizados</w:t>
+            </w:r>
+          </w:p>
+        </w:tc>
+        <w:tc>
+          <w:tcPr>
+            <w:tcW w:w="1240" w:type="dxa"/>
+            <w:shd w:val="clear" w:color="auto" w:fill="1F3A5F"/>
+            <w:tcMar>
+              <w:top w:w="60" w:type="dxa"/>
+              <w:left w:w="100" w:type="dxa"/>
+              <w:bottom w:w="60" w:type="dxa"/>
+              <w:right w:w="100" w:type="dxa"/>
+            </w:tcMar>
+          </w:tcPr>
+          <w:p>
+            <w:pPr>
+              <w:spacing w:after="0" w:line="240" w:lineRule="auto"/>
+              <w:rPr/>
+            </w:pPr>
+            <w:r>
+              <w:rPr>
+                <w:b/>
+                <w:bCs/>
+                <w:color w:val="FFFFFF"/>
+                <w:sz w:val="18"/>
+                <w:szCs w:val="18"/>
+                <w:rtl w:val="0"/>
+              </w:rPr>
+              <w:t xml:space="preserve">Hallazgos (vulnerable → corregida)</w:t>
+            </w:r>
+          </w:p>
+        </w:tc>
+        <w:tc>
+          <w:tcPr>
+            <w:tcW w:w="1240" w:type="dxa"/>
+            <w:shd w:val="clear" w:color="auto" w:fill="1F3A5F"/>
+            <w:tcMar>
+              <w:top w:w="60" w:type="dxa"/>
+              <w:left w:w="100" w:type="dxa"/>
+              <w:bottom w:w="60" w:type="dxa"/>
+              <w:right w:w="100" w:type="dxa"/>
+            </w:tcMar>
+          </w:tcPr>
+          <w:p>
+            <w:pPr>
+              <w:spacing w:after="0" w:line="240" w:lineRule="auto"/>
+              <w:rPr/>
+            </w:pPr>
+            <w:r>
+              <w:rPr>
+                <w:b/>
+                <w:bCs/>
+                <w:color w:val="FFFFFF"/>
+                <w:sz w:val="18"/>
+                <w:szCs w:val="18"/>
+                <w:rtl w:val="0"/>
+              </w:rPr>
+              <w:t xml:space="preserve">Resultado</w:t>
+            </w:r>
+          </w:p>
+        </w:tc>
+      </w:tr>
+      <w:tr>
+        <w:tc>
+          <w:tcPr>
+            <w:tcW w:w="3160" w:type="dxa"/>
+            <w:shd w:val="clear" w:color="auto" w:fill="EAF1F8"/>
+            <w:tcMar>
+              <w:top w:w="60" w:type="dxa"/>
+              <w:left w:w="100" w:type="dxa"/>
+              <w:bottom w:w="60" w:type="dxa"/>
+              <w:right w:w="100" w:type="dxa"/>
+            </w:tcMar>
+          </w:tcPr>
+          <w:p>
+            <w:pPr>
+              <w:spacing w:after="0" w:line="240" w:lineRule="auto"/>
+              <w:rPr/>
+            </w:pPr>
+            <w:r>
+              <w:rPr>
+                <w:b/>
+                <w:bCs/>
+                <w:color w:val="1F3A5F"/>
+                <w:sz w:val="18"/>
+                <w:szCs w:val="18"/>
+                <w:rtl w:val="0"/>
+              </w:rPr>
+              <w:t xml:space="preserve">@hypequery/clickhouse 2.5.0 → 2.5.1</w:t>
+            </w:r>
+          </w:p>
+        </w:tc>
+        <w:tc>
+          <w:tcPr>
+            <w:tcW w:w="1240" w:type="dxa"/>
+            <w:shd w:val="clear" w:color="auto" w:fill="FFFFFF"/>
+            <w:tcMar>
+              <w:top w:w="60" w:type="dxa"/>
+              <w:left w:w="100" w:type="dxa"/>
+              <w:bottom w:w="60" w:type="dxa"/>
+              <w:right w:w="100" w:type="dxa"/>
+            </w:tcMar>
+          </w:tcPr>
+          <w:p>
+            <w:pPr>
+              <w:spacing w:after="0" w:line="240" w:lineRule="auto"/>
+              <w:rPr/>
+            </w:pPr>
+            <w:r>
+              <w:rPr>
+                <w:color w:val="222222"/>
+                <w:sz w:val="18"/>
+                <w:szCs w:val="18"/>
+                <w:rtl w:val="0"/>
+              </w:rPr>
+              <w:t xml:space="preserve">89</w:t>
+            </w:r>
+          </w:p>
+        </w:tc>
+        <w:tc>
+          <w:tcPr>
+            <w:tcW w:w="1240" w:type="dxa"/>
+            <w:shd w:val="clear" w:color="auto" w:fill="FFFFFF"/>
+            <w:tcMar>
+              <w:top w:w="60" w:type="dxa"/>
+              <w:left w:w="100" w:type="dxa"/>
+              <w:bottom w:w="60" w:type="dxa"/>
+              <w:right w:w="100" w:type="dxa"/>
+            </w:tcMar>
+          </w:tcPr>
+          <w:p>
+            <w:pPr>
+              <w:spacing w:after="0" w:line="240" w:lineRule="auto"/>
+              <w:rPr/>
+            </w:pPr>
+            <w:r>
+              <w:rPr>
+                <w:color w:val="222222"/>
+                <w:sz w:val="18"/>
+                <w:szCs w:val="18"/>
+                <w:rtl w:val="0"/>
+              </w:rPr>
+              <w:t xml:space="preserve">GHSA-6wcc-39rp-hh9p</w:t>
+            </w:r>
+          </w:p>
+        </w:tc>
+        <w:tc>
+          <w:tcPr>
+            <w:tcW w:w="1240" w:type="dxa"/>
+            <w:shd w:val="clear" w:color="auto" w:fill="FFFFFF"/>
+            <w:tcMar>
+              <w:top w:w="60" w:type="dxa"/>
+              <w:left w:w="100" w:type="dxa"/>
+              <w:bottom w:w="60" w:type="dxa"/>
+              <w:right w:w="100" w:type="dxa"/>
+            </w:tcMar>
+          </w:tcPr>
+          <w:p>
+            <w:pPr>
+              <w:spacing w:after="0" w:line="240" w:lineRule="auto"/>
+              <w:rPr/>
+            </w:pPr>
+            <w:r>
+              <w:rPr>
+                <w:color w:val="222222"/>
+                <w:sz w:val="18"/>
+                <w:szCs w:val="18"/>
+                <w:rtl w:val="0"/>
+              </w:rPr>
+              <w:t xml:space="preserve">0</w:t>
+            </w:r>
+          </w:p>
+        </w:tc>
+        <w:tc>
+          <w:tcPr>
+            <w:tcW w:w="1240" w:type="dxa"/>
+            <w:shd w:val="clear" w:color="auto" w:fill="FFFFFF"/>
+            <w:tcMar>
+              <w:top w:w="60" w:type="dxa"/>
+              <w:left w:w="100" w:type="dxa"/>
+              <w:bottom w:w="60" w:type="dxa"/>
+              <w:right w:w="100" w:type="dxa"/>
+            </w:tcMar>
+          </w:tcPr>
+          <w:p>
+            <w:pPr>
+              <w:spacing w:after="0" w:line="240" w:lineRule="auto"/>
+              <w:rPr/>
+            </w:pPr>
+            <w:r>
+              <w:rPr>
+                <w:color w:val="222222"/>
+                <w:sz w:val="18"/>
+                <w:szCs w:val="18"/>
+                <w:rtl w:val="0"/>
+              </w:rPr>
+              <w:t xml:space="preserve">—</w:t>
+            </w:r>
+          </w:p>
+        </w:tc>
+        <w:tc>
+          <w:tcPr>
+            <w:tcW w:w="1240" w:type="dxa"/>
+            <w:shd w:val="clear" w:color="auto" w:fill="FFFFFF"/>
+            <w:tcMar>
+              <w:top w:w="60" w:type="dxa"/>
+              <w:left w:w="100" w:type="dxa"/>
+              <w:bottom w:w="60" w:type="dxa"/>
+              <w:right w:w="100" w:type="dxa"/>
+            </w:tcMar>
+          </w:tcPr>
+          <w:p>
+            <w:pPr>
+              <w:spacing w:after="0" w:line="240" w:lineRule="auto"/>
+              <w:rPr/>
+            </w:pPr>
+            <w:r>
+              <w:rPr>
+                <w:color w:val="222222"/>
+                <w:sz w:val="18"/>
+                <w:szCs w:val="18"/>
+                <w:rtl w:val="0"/>
+              </w:rPr>
+              <w:t xml:space="preserve">Sin código fuente publicado</w:t>
+            </w:r>
+          </w:p>
+        </w:tc>
+      </w:tr>
+      <w:tr>
+        <w:tc>
+          <w:tcPr>
+            <w:tcW w:w="3160" w:type="dxa"/>
+            <w:shd w:val="clear" w:color="auto" w:fill="EAF1F8"/>
+            <w:tcMar>
+              <w:top w:w="60" w:type="dxa"/>
+              <w:left w:w="100" w:type="dxa"/>
+              <w:bottom w:w="60" w:type="dxa"/>
+              <w:right w:w="100" w:type="dxa"/>
+            </w:tcMar>
+          </w:tcPr>
+          <w:p>
+            <w:pPr>
+              <w:spacing w:after="0" w:line="240" w:lineRule="auto"/>
+              <w:rPr/>
+            </w:pPr>
+            <w:r>
+              <w:rPr>
+                <w:b/>
+                <w:bCs/>
+                <w:color w:val="1F3A5F"/>
+                <w:sz w:val="18"/>
+                <w:szCs w:val="18"/>
+                <w:rtl w:val="0"/>
+              </w:rPr>
+              <w:t xml:space="preserve">@anthropic-ai/claude-code 2.1.162 → 2.1.163</w:t>
+            </w:r>
+          </w:p>
+        </w:tc>
+        <w:tc>
+          <w:tcPr>
+            <w:tcW w:w="1240" w:type="dxa"/>
+            <w:shd w:val="clear" w:color="auto" w:fill="FFFFFF"/>
+            <w:tcMar>
+              <w:top w:w="60" w:type="dxa"/>
+              <w:left w:w="100" w:type="dxa"/>
+              <w:bottom w:w="60" w:type="dxa"/>
+              <w:right w:w="100" w:type="dxa"/>
+            </w:tcMar>
+          </w:tcPr>
+          <w:p>
+            <w:pPr>
+              <w:spacing w:after="0" w:line="240" w:lineRule="auto"/>
+              <w:rPr/>
+            </w:pPr>
+            <w:r>
+              <w:rPr>
+                <w:color w:val="222222"/>
+                <w:sz w:val="18"/>
+                <w:szCs w:val="18"/>
+                <w:rtl w:val="0"/>
+              </w:rPr>
+              <w:t xml:space="preserve">78</w:t>
+            </w:r>
+          </w:p>
+        </w:tc>
+        <w:tc>
+          <w:tcPr>
+            <w:tcW w:w="1240" w:type="dxa"/>
+            <w:shd w:val="clear" w:color="auto" w:fill="FFFFFF"/>
+            <w:tcMar>
+              <w:top w:w="60" w:type="dxa"/>
+              <w:left w:w="100" w:type="dxa"/>
+              <w:bottom w:w="60" w:type="dxa"/>
+              <w:right w:w="100" w:type="dxa"/>
+            </w:tcMar>
+          </w:tcPr>
+          <w:p>
+            <w:pPr>
+              <w:spacing w:after="0" w:line="240" w:lineRule="auto"/>
+              <w:rPr/>
+            </w:pPr>
+            <w:r>
+              <w:rPr>
+                <w:color w:val="222222"/>
+                <w:sz w:val="18"/>
+                <w:szCs w:val="18"/>
+                <w:rtl w:val="0"/>
+              </w:rPr>
+              <w:t xml:space="preserve">GHSA-7835-87q9-rgvv</w:t>
+            </w:r>
+          </w:p>
+        </w:tc>
+        <w:tc>
+          <w:tcPr>
+            <w:tcW w:w="1240" w:type="dxa"/>
+            <w:shd w:val="clear" w:color="auto" w:fill="FFFFFF"/>
+            <w:tcMar>
+              <w:top w:w="60" w:type="dxa"/>
+              <w:left w:w="100" w:type="dxa"/>
+              <w:bottom w:w="60" w:type="dxa"/>
+              <w:right w:w="100" w:type="dxa"/>
+            </w:tcMar>
+          </w:tcPr>
+          <w:p>
+            <w:pPr>
+              <w:spacing w:after="0" w:line="240" w:lineRule="auto"/>
+              <w:rPr/>
+            </w:pPr>
+            <w:r>
+              <w:rPr>
+                <w:color w:val="222222"/>
+                <w:sz w:val="18"/>
+                <w:szCs w:val="18"/>
+                <w:rtl w:val="0"/>
+              </w:rPr>
+              <w:t xml:space="preserve">3</w:t>
+            </w:r>
+          </w:p>
+        </w:tc>
+        <w:tc>
+          <w:tcPr>
+            <w:tcW w:w="1240" w:type="dxa"/>
+            <w:shd w:val="clear" w:color="auto" w:fill="FFFFFF"/>
+            <w:tcMar>
+              <w:top w:w="60" w:type="dxa"/>
+              <w:left w:w="100" w:type="dxa"/>
+              <w:bottom w:w="60" w:type="dxa"/>
+              <w:right w:w="100" w:type="dxa"/>
+            </w:tcMar>
+          </w:tcPr>
+          <w:p>
+            <w:pPr>
+              <w:spacing w:after="0" w:line="240" w:lineRule="auto"/>
+              <w:rPr/>
+            </w:pPr>
+            <w:r>
+              <w:rPr>
+                <w:color w:val="222222"/>
+                <w:sz w:val="18"/>
+                <w:szCs w:val="18"/>
+                <w:rtl w:val="0"/>
+              </w:rPr>
+              <w:t xml:space="preserve">0 → 0</w:t>
+            </w:r>
+          </w:p>
+        </w:tc>
+        <w:tc>
+          <w:tcPr>
+            <w:tcW w:w="1240" w:type="dxa"/>
+            <w:shd w:val="clear" w:color="auto" w:fill="FFFFFF"/>
+            <w:tcMar>
+              <w:top w:w="60" w:type="dxa"/>
+              <w:left w:w="100" w:type="dxa"/>
+              <w:bottom w:w="60" w:type="dxa"/>
+              <w:right w:w="100" w:type="dxa"/>
+            </w:tcMar>
+          </w:tcPr>
+          <w:p>
+            <w:pPr>
+              <w:spacing w:after="0" w:line="240" w:lineRule="auto"/>
+              <w:rPr/>
+            </w:pPr>
+            <w:r>
+              <w:rPr>
+                <w:color w:val="222222"/>
+                <w:sz w:val="18"/>
+                <w:szCs w:val="18"/>
+                <w:rtl w:val="0"/>
+              </w:rPr>
+              <w:t xml:space="preserve">No detectado</w:t>
+            </w:r>
+          </w:p>
+        </w:tc>
+      </w:tr>
+      <w:tr>
+        <w:tc>
+          <w:tcPr>
+            <w:tcW w:w="3160" w:type="dxa"/>
+            <w:shd w:val="clear" w:color="auto" w:fill="EAF1F8"/>
+            <w:tcMar>
+              <w:top w:w="60" w:type="dxa"/>
+              <w:left w:w="100" w:type="dxa"/>
+              <w:bottom w:w="60" w:type="dxa"/>
+              <w:right w:w="100" w:type="dxa"/>
+            </w:tcMar>
+          </w:tcPr>
+          <w:p>
+            <w:pPr>
+              <w:spacing w:after="0" w:line="240" w:lineRule="auto"/>
+              <w:rPr/>
+            </w:pPr>
+            <w:r>
+              <w:rPr>
+                <w:b/>
+                <w:bCs/>
+                <w:color w:val="1F3A5F"/>
+                <w:sz w:val="18"/>
+                <w:szCs w:val="18"/>
+                <w:rtl w:val="0"/>
+              </w:rPr>
+              <w:t xml:space="preserve">sanitize-html 2.17.4 → 2.17.5</w:t>
+            </w:r>
+          </w:p>
+        </w:tc>
+        <w:tc>
+          <w:tcPr>
+            <w:tcW w:w="1240" w:type="dxa"/>
+            <w:shd w:val="clear" w:color="auto" w:fill="FFFFFF"/>
+            <w:tcMar>
+              <w:top w:w="60" w:type="dxa"/>
+              <w:left w:w="100" w:type="dxa"/>
+              <w:bottom w:w="60" w:type="dxa"/>
+              <w:right w:w="100" w:type="dxa"/>
+            </w:tcMar>
+          </w:tcPr>
+          <w:p>
+            <w:pPr>
+              <w:spacing w:after="0" w:line="240" w:lineRule="auto"/>
+              <w:rPr/>
+            </w:pPr>
+            <w:r>
+              <w:rPr>
+                <w:color w:val="222222"/>
+                <w:sz w:val="18"/>
+                <w:szCs w:val="18"/>
+                <w:rtl w:val="0"/>
+              </w:rPr>
+              <w:t xml:space="preserve">79</w:t>
+            </w:r>
+          </w:p>
+        </w:tc>
+        <w:tc>
+          <w:tcPr>
+            <w:tcW w:w="1240" w:type="dxa"/>
+            <w:shd w:val="clear" w:color="auto" w:fill="FFFFFF"/>
+            <w:tcMar>
+              <w:top w:w="60" w:type="dxa"/>
+              <w:left w:w="100" w:type="dxa"/>
+              <w:bottom w:w="60" w:type="dxa"/>
+              <w:right w:w="100" w:type="dxa"/>
+            </w:tcMar>
+          </w:tcPr>
+          <w:p>
+            <w:pPr>
+              <w:spacing w:after="0" w:line="240" w:lineRule="auto"/>
+              <w:rPr/>
+            </w:pPr>
+            <w:r>
+              <w:rPr>
+                <w:color w:val="222222"/>
+                <w:sz w:val="18"/>
+                <w:szCs w:val="18"/>
+                <w:rtl w:val="0"/>
+              </w:rPr>
+              <w:t xml:space="preserve">GHSA-vccv-cmxp-4j9h</w:t>
+            </w:r>
+          </w:p>
+        </w:tc>
+        <w:tc>
+          <w:tcPr>
+            <w:tcW w:w="1240" w:type="dxa"/>
+            <w:shd w:val="clear" w:color="auto" w:fill="FFFFFF"/>
+            <w:tcMar>
+              <w:top w:w="60" w:type="dxa"/>
+              <w:left w:w="100" w:type="dxa"/>
+              <w:bottom w:w="60" w:type="dxa"/>
+              <w:right w:w="100" w:type="dxa"/>
+            </w:tcMar>
+          </w:tcPr>
+          <w:p>
+            <w:pPr>
+              <w:spacing w:after="0" w:line="240" w:lineRule="auto"/>
+              <w:rPr/>
+            </w:pPr>
+            <w:r>
+              <w:rPr>
+                <w:color w:val="222222"/>
+                <w:sz w:val="18"/>
+                <w:szCs w:val="18"/>
+                <w:rtl w:val="0"/>
+              </w:rPr>
+              <w:t xml:space="preserve">1</w:t>
+            </w:r>
+          </w:p>
+        </w:tc>
+        <w:tc>
+          <w:tcPr>
+            <w:tcW w:w="1240" w:type="dxa"/>
+            <w:shd w:val="clear" w:color="auto" w:fill="FFFFFF"/>
+            <w:tcMar>
+              <w:top w:w="60" w:type="dxa"/>
+              <w:left w:w="100" w:type="dxa"/>
+              <w:bottom w:w="60" w:type="dxa"/>
+              <w:right w:w="100" w:type="dxa"/>
+            </w:tcMar>
+          </w:tcPr>
+          <w:p>
+            <w:pPr>
+              <w:spacing w:after="0" w:line="240" w:lineRule="auto"/>
+              <w:rPr/>
+            </w:pPr>
+            <w:r>
+              <w:rPr>
+                <w:color w:val="222222"/>
+                <w:sz w:val="18"/>
+                <w:szCs w:val="18"/>
+                <w:rtl w:val="0"/>
+              </w:rPr>
+              <w:t xml:space="preserve">0 → 0</w:t>
+            </w:r>
+          </w:p>
+        </w:tc>
+        <w:tc>
+          <w:tcPr>
+            <w:tcW w:w="1240" w:type="dxa"/>
+            <w:shd w:val="clear" w:color="auto" w:fill="FFFFFF"/>
+            <w:tcMar>
+              <w:top w:w="60" w:type="dxa"/>
+              <w:left w:w="100" w:type="dxa"/>
+              <w:bottom w:w="60" w:type="dxa"/>
+              <w:right w:w="100" w:type="dxa"/>
+            </w:tcMar>
+          </w:tcPr>
+          <w:p>
+            <w:pPr>
+              <w:spacing w:after="0" w:line="240" w:lineRule="auto"/>
+              <w:rPr/>
+            </w:pPr>
+            <w:r>
+              <w:rPr>
+                <w:color w:val="222222"/>
+                <w:sz w:val="18"/>
+                <w:szCs w:val="18"/>
+                <w:rtl w:val="0"/>
+              </w:rPr>
+              <w:t xml:space="preserve">No detectado</w:t>
+            </w:r>
+          </w:p>
+        </w:tc>
+      </w:tr>
+      <w:tr>
+        <w:tc>
+          <w:tcPr>
+            <w:tcW w:w="3160" w:type="dxa"/>
+            <w:shd w:val="clear" w:color="auto" w:fill="EAF1F8"/>
+            <w:tcMar>
+              <w:top w:w="60" w:type="dxa"/>
+              <w:left w:w="100" w:type="dxa"/>
+              <w:bottom w:w="60" w:type="dxa"/>
+              <w:right w:w="100" w:type="dxa"/>
+            </w:tcMar>
+          </w:tcPr>
+          <w:p>
+            <w:pPr>
+              <w:spacing w:after="0" w:line="240" w:lineRule="auto"/>
+              <w:rPr/>
+            </w:pPr>
+            <w:r>
+              <w:rPr>
+                <w:b/>
+                <w:bCs/>
+                <w:color w:val="1F3A5F"/>
+                <w:sz w:val="18"/>
+                <w:szCs w:val="18"/>
+                <w:rtl w:val="0"/>
+              </w:rPr>
+              <w:t xml:space="preserve">sanitize-html 2.17.6 → 2.17.7</w:t>
+            </w:r>
+          </w:p>
+        </w:tc>
+        <w:tc>
+          <w:tcPr>
+            <w:tcW w:w="1240" w:type="dxa"/>
+            <w:shd w:val="clear" w:color="auto" w:fill="FFFFFF"/>
+            <w:tcMar>
+              <w:top w:w="60" w:type="dxa"/>
+              <w:left w:w="100" w:type="dxa"/>
+              <w:bottom w:w="60" w:type="dxa"/>
+              <w:right w:w="100" w:type="dxa"/>
+            </w:tcMar>
+          </w:tcPr>
+          <w:p>
+            <w:pPr>
+              <w:spacing w:after="0" w:line="240" w:lineRule="auto"/>
+              <w:rPr/>
+            </w:pPr>
+            <w:r>
+              <w:rPr>
+                <w:color w:val="222222"/>
+                <w:sz w:val="18"/>
+                <w:szCs w:val="18"/>
+                <w:rtl w:val="0"/>
+              </w:rPr>
+              <w:t xml:space="preserve">79</w:t>
+            </w:r>
+          </w:p>
+        </w:tc>
+        <w:tc>
+          <w:tcPr>
+            <w:tcW w:w="1240" w:type="dxa"/>
+            <w:shd w:val="clear" w:color="auto" w:fill="FFFFFF"/>
+            <w:tcMar>
+              <w:top w:w="60" w:type="dxa"/>
+              <w:left w:w="100" w:type="dxa"/>
+              <w:bottom w:w="60" w:type="dxa"/>
+              <w:right w:w="100" w:type="dxa"/>
+            </w:tcMar>
+          </w:tcPr>
+          <w:p>
+            <w:pPr>
+              <w:spacing w:after="0" w:line="240" w:lineRule="auto"/>
+              <w:rPr/>
+            </w:pPr>
+            <w:r>
+              <w:rPr>
+                <w:color w:val="222222"/>
+                <w:sz w:val="18"/>
+                <w:szCs w:val="18"/>
+                <w:rtl w:val="0"/>
+              </w:rPr>
+              <w:t xml:space="preserve">GHSA-g8qq-57p8-ggw5</w:t>
+            </w:r>
+          </w:p>
+        </w:tc>
+        <w:tc>
+          <w:tcPr>
+            <w:tcW w:w="1240" w:type="dxa"/>
+            <w:shd w:val="clear" w:color="auto" w:fill="FFFFFF"/>
+            <w:tcMar>
+              <w:top w:w="60" w:type="dxa"/>
+              <w:left w:w="100" w:type="dxa"/>
+              <w:bottom w:w="60" w:type="dxa"/>
+              <w:right w:w="100" w:type="dxa"/>
+            </w:tcMar>
+          </w:tcPr>
+          <w:p>
+            <w:pPr>
+              <w:spacing w:after="0" w:line="240" w:lineRule="auto"/>
+              <w:rPr/>
+            </w:pPr>
+            <w:r>
+              <w:rPr>
+                <w:color w:val="222222"/>
+                <w:sz w:val="18"/>
+                <w:szCs w:val="18"/>
+                <w:rtl w:val="0"/>
+              </w:rPr>
+              <w:t xml:space="preserve">1</w:t>
+            </w:r>
+          </w:p>
+        </w:tc>
+        <w:tc>
+          <w:tcPr>
+            <w:tcW w:w="1240" w:type="dxa"/>
+            <w:shd w:val="clear" w:color="auto" w:fill="FFFFFF"/>
+            <w:tcMar>
+              <w:top w:w="60" w:type="dxa"/>
+              <w:left w:w="100" w:type="dxa"/>
+              <w:bottom w:w="60" w:type="dxa"/>
+              <w:right w:w="100" w:type="dxa"/>
+            </w:tcMar>
+          </w:tcPr>
+          <w:p>
+            <w:pPr>
+              <w:spacing w:after="0" w:line="240" w:lineRule="auto"/>
+              <w:rPr/>
+            </w:pPr>
+            <w:r>
+              <w:rPr>
+                <w:color w:val="222222"/>
+                <w:sz w:val="18"/>
+                <w:szCs w:val="18"/>
+                <w:rtl w:val="0"/>
+              </w:rPr>
+              <w:t xml:space="preserve">0 → 0</w:t>
+            </w:r>
+          </w:p>
+        </w:tc>
+        <w:tc>
+          <w:tcPr>
+            <w:tcW w:w="1240" w:type="dxa"/>
+            <w:shd w:val="clear" w:color="auto" w:fill="FFFFFF"/>
+            <w:tcMar>
+              <w:top w:w="60" w:type="dxa"/>
+              <w:left w:w="100" w:type="dxa"/>
+              <w:bottom w:w="60" w:type="dxa"/>
+              <w:right w:w="100" w:type="dxa"/>
+            </w:tcMar>
+          </w:tcPr>
+          <w:p>
+            <w:pPr>
+              <w:spacing w:after="0" w:line="240" w:lineRule="auto"/>
+              <w:rPr/>
+            </w:pPr>
+            <w:r>
+              <w:rPr>
+                <w:color w:val="222222"/>
+                <w:sz w:val="18"/>
+                <w:szCs w:val="18"/>
+                <w:rtl w:val="0"/>
+              </w:rPr>
+              <w:t xml:space="preserve">No detectado</w:t>
+            </w:r>
+          </w:p>
+        </w:tc>
+      </w:tr>
+      <w:tr>
+        <w:tc>
+          <w:tcPr>
+            <w:tcW w:w="3160" w:type="dxa"/>
+            <w:shd w:val="clear" w:color="auto" w:fill="EAF1F8"/>
+            <w:tcMar>
+              <w:top w:w="60" w:type="dxa"/>
+              <w:left w:w="100" w:type="dxa"/>
+              <w:bottom w:w="60" w:type="dxa"/>
+              <w:right w:w="100" w:type="dxa"/>
+            </w:tcMar>
+          </w:tcPr>
+          <w:p>
+            <w:pPr>
+              <w:spacing w:after="0" w:line="240" w:lineRule="auto"/>
+              <w:rPr/>
+            </w:pPr>
+            <w:r>
+              <w:rPr>
+                <w:b/>
+                <w:bCs/>
+                <w:color w:val="1F3A5F"/>
+                <w:sz w:val="18"/>
+                <w:szCs w:val="18"/>
+                <w:rtl w:val="0"/>
+              </w:rPr>
+              <w:t xml:space="preserve">defuddle 0.19.0 → 0.19.1</w:t>
+            </w:r>
+          </w:p>
+        </w:tc>
+        <w:tc>
+          <w:tcPr>
+            <w:tcW w:w="1240" w:type="dxa"/>
+            <w:shd w:val="clear" w:color="auto" w:fill="FFFFFF"/>
+            <w:tcMar>
+              <w:top w:w="60" w:type="dxa"/>
+              <w:left w:w="100" w:type="dxa"/>
+              <w:bottom w:w="60" w:type="dxa"/>
+              <w:right w:w="100" w:type="dxa"/>
+            </w:tcMar>
+          </w:tcPr>
+          <w:p>
+            <w:pPr>
+              <w:spacing w:after="0" w:line="240" w:lineRule="auto"/>
+              <w:rPr/>
+            </w:pPr>
+            <w:r>
+              <w:rPr>
+                <w:color w:val="222222"/>
+                <w:sz w:val="18"/>
+                <w:szCs w:val="18"/>
+                <w:rtl w:val="0"/>
+              </w:rPr>
+              <w:t xml:space="preserve">79</w:t>
+            </w:r>
+          </w:p>
+        </w:tc>
+        <w:tc>
+          <w:tcPr>
+            <w:tcW w:w="1240" w:type="dxa"/>
+            <w:shd w:val="clear" w:color="auto" w:fill="FFFFFF"/>
+            <w:tcMar>
+              <w:top w:w="60" w:type="dxa"/>
+              <w:left w:w="100" w:type="dxa"/>
+              <w:bottom w:w="60" w:type="dxa"/>
+              <w:right w:w="100" w:type="dxa"/>
+            </w:tcMar>
+          </w:tcPr>
+          <w:p>
+            <w:pPr>
+              <w:spacing w:after="0" w:line="240" w:lineRule="auto"/>
+              <w:rPr/>
+            </w:pPr>
+            <w:r>
+              <w:rPr>
+                <w:color w:val="222222"/>
+                <w:sz w:val="18"/>
+                <w:szCs w:val="18"/>
+                <w:rtl w:val="0"/>
+              </w:rPr>
+              <w:t xml:space="preserve">GHSA-jg4p-g6xj-4qmf</w:t>
+            </w:r>
+          </w:p>
+        </w:tc>
+        <w:tc>
+          <w:tcPr>
+            <w:tcW w:w="1240" w:type="dxa"/>
+            <w:shd w:val="clear" w:color="auto" w:fill="FFFFFF"/>
+            <w:tcMar>
+              <w:top w:w="60" w:type="dxa"/>
+              <w:left w:w="100" w:type="dxa"/>
+              <w:bottom w:w="60" w:type="dxa"/>
+              <w:right w:w="100" w:type="dxa"/>
+            </w:tcMar>
+          </w:tcPr>
+          <w:p>
+            <w:pPr>
+              <w:spacing w:after="0" w:line="240" w:lineRule="auto"/>
+              <w:rPr/>
+            </w:pPr>
+            <w:r>
+              <w:rPr>
+                <w:color w:val="222222"/>
+                <w:sz w:val="18"/>
+                <w:szCs w:val="18"/>
+                <w:rtl w:val="0"/>
+              </w:rPr>
+              <w:t xml:space="preserve">0</w:t>
+            </w:r>
+          </w:p>
+        </w:tc>
+        <w:tc>
+          <w:tcPr>
+            <w:tcW w:w="1240" w:type="dxa"/>
+            <w:shd w:val="clear" w:color="auto" w:fill="FFFFFF"/>
+            <w:tcMar>
+              <w:top w:w="60" w:type="dxa"/>
+              <w:left w:w="100" w:type="dxa"/>
+              <w:bottom w:w="60" w:type="dxa"/>
+              <w:right w:w="100" w:type="dxa"/>
+            </w:tcMar>
+          </w:tcPr>
+          <w:p>
+            <w:pPr>
+              <w:spacing w:after="0" w:line="240" w:lineRule="auto"/>
+              <w:rPr/>
+            </w:pPr>
+            <w:r>
+              <w:rPr>
+                <w:color w:val="222222"/>
+                <w:sz w:val="18"/>
+                <w:szCs w:val="18"/>
+                <w:rtl w:val="0"/>
+              </w:rPr>
+              <w:t xml:space="preserve">—</w:t>
+            </w:r>
+          </w:p>
+        </w:tc>
+        <w:tc>
+          <w:tcPr>
+            <w:tcW w:w="1240" w:type="dxa"/>
+            <w:shd w:val="clear" w:color="auto" w:fill="FFFFFF"/>
+            <w:tcMar>
+              <w:top w:w="60" w:type="dxa"/>
+              <w:left w:w="100" w:type="dxa"/>
+              <w:bottom w:w="60" w:type="dxa"/>
+              <w:right w:w="100" w:type="dxa"/>
+            </w:tcMar>
+          </w:tcPr>
+          <w:p>
+            <w:pPr>
+              <w:spacing w:after="0" w:line="240" w:lineRule="auto"/>
+              <w:rPr/>
+            </w:pPr>
+            <w:r>
+              <w:rPr>
+                <w:color w:val="222222"/>
+                <w:sz w:val="18"/>
+                <w:szCs w:val="18"/>
+                <w:rtl w:val="0"/>
+              </w:rPr>
+              <w:t xml:space="preserve">Sin código fuente publicado</w:t>
+            </w:r>
+          </w:p>
+        </w:tc>
+      </w:tr>
+      <w:tr>
+        <w:tc>
+          <w:tcPr>
+            <w:tcW w:w="3160" w:type="dxa"/>
+            <w:shd w:val="clear" w:color="auto" w:fill="EAF1F8"/>
+            <w:tcMar>
+              <w:top w:w="60" w:type="dxa"/>
+              <w:left w:w="100" w:type="dxa"/>
+              <w:bottom w:w="60" w:type="dxa"/>
+              <w:right w:w="100" w:type="dxa"/>
+            </w:tcMar>
+          </w:tcPr>
+          <w:p>
+            <w:pPr>
+              <w:spacing w:after="0" w:line="240" w:lineRule="auto"/>
+              <w:rPr/>
+            </w:pPr>
+            <w:r>
+              <w:rPr>
+                <w:b/>
+                <w:bCs/>
+                <w:color w:val="1F3A5F"/>
+                <w:sz w:val="18"/>
+                <w:szCs w:val="18"/>
+                <w:rtl w:val="0"/>
+              </w:rPr>
+              <w:t xml:space="preserve">dompurify 3.4.12 → 3.4.13</w:t>
+            </w:r>
+          </w:p>
+        </w:tc>
+        <w:tc>
+          <w:tcPr>
+            <w:tcW w:w="1240" w:type="dxa"/>
+            <w:shd w:val="clear" w:color="auto" w:fill="FFFFFF"/>
+            <w:tcMar>
+              <w:top w:w="60" w:type="dxa"/>
+              <w:left w:w="100" w:type="dxa"/>
+              <w:bottom w:w="60" w:type="dxa"/>
+              <w:right w:w="100" w:type="dxa"/>
+            </w:tcMar>
+          </w:tcPr>
+          <w:p>
+            <w:pPr>
+              <w:spacing w:after="0" w:line="240" w:lineRule="auto"/>
+              <w:rPr/>
+            </w:pPr>
+            <w:r>
+              <w:rPr>
+                <w:color w:val="222222"/>
+                <w:sz w:val="18"/>
+                <w:szCs w:val="18"/>
+                <w:rtl w:val="0"/>
+              </w:rPr>
+              <w:t xml:space="preserve">79</w:t>
+            </w:r>
+          </w:p>
+        </w:tc>
+        <w:tc>
+          <w:tcPr>
+            <w:tcW w:w="1240" w:type="dxa"/>
+            <w:shd w:val="clear" w:color="auto" w:fill="FFFFFF"/>
+            <w:tcMar>
+              <w:top w:w="60" w:type="dxa"/>
+              <w:left w:w="100" w:type="dxa"/>
+              <w:bottom w:w="60" w:type="dxa"/>
+              <w:right w:w="100" w:type="dxa"/>
+            </w:tcMar>
+          </w:tcPr>
+          <w:p>
+            <w:pPr>
+              <w:spacing w:after="0" w:line="240" w:lineRule="auto"/>
+              <w:rPr/>
+            </w:pPr>
+            <w:r>
+              <w:rPr>
+                <w:color w:val="222222"/>
+                <w:sz w:val="18"/>
+                <w:szCs w:val="18"/>
+                <w:rtl w:val="0"/>
+              </w:rPr>
+              <w:t xml:space="preserve">GHSA-55q2-fjhq-7xh7</w:t>
+            </w:r>
+          </w:p>
+        </w:tc>
+        <w:tc>
+          <w:tcPr>
+            <w:tcW w:w="1240" w:type="dxa"/>
+            <w:shd w:val="clear" w:color="auto" w:fill="FFFFFF"/>
+            <w:tcMar>
+              <w:top w:w="60" w:type="dxa"/>
+              <w:left w:w="100" w:type="dxa"/>
+              <w:bottom w:w="60" w:type="dxa"/>
+              <w:right w:w="100" w:type="dxa"/>
+            </w:tcMar>
+          </w:tcPr>
+          <w:p>
+            <w:pPr>
+              <w:spacing w:after="0" w:line="240" w:lineRule="auto"/>
+              <w:rPr/>
+            </w:pPr>
+            <w:r>
+              <w:rPr>
+                <w:color w:val="222222"/>
+                <w:sz w:val="18"/>
+                <w:szCs w:val="18"/>
+                <w:rtl w:val="0"/>
+              </w:rPr>
+              <w:t xml:space="preserve">7</w:t>
+            </w:r>
+          </w:p>
+        </w:tc>
+        <w:tc>
+          <w:tcPr>
+            <w:tcW w:w="1240" w:type="dxa"/>
+            <w:shd w:val="clear" w:color="auto" w:fill="FFFFFF"/>
+            <w:tcMar>
+              <w:top w:w="60" w:type="dxa"/>
+              <w:left w:w="100" w:type="dxa"/>
+              <w:bottom w:w="60" w:type="dxa"/>
+              <w:right w:w="100" w:type="dxa"/>
+            </w:tcMar>
+          </w:tcPr>
+          <w:p>
+            <w:pPr>
+              <w:spacing w:after="0" w:line="240" w:lineRule="auto"/>
+              <w:rPr/>
+            </w:pPr>
+            <w:r>
+              <w:rPr>
+                <w:color w:val="222222"/>
+                <w:sz w:val="18"/>
+                <w:szCs w:val="18"/>
+                <w:rtl w:val="0"/>
+              </w:rPr>
+              <w:t xml:space="preserve">1 → 1</w:t>
+            </w:r>
+          </w:p>
+        </w:tc>
+        <w:tc>
+          <w:tcPr>
+            <w:tcW w:w="1240" w:type="dxa"/>
+            <w:shd w:val="clear" w:color="auto" w:fill="FFFFFF"/>
+            <w:tcMar>
+              <w:top w:w="60" w:type="dxa"/>
+              <w:left w:w="100" w:type="dxa"/>
+              <w:bottom w:w="60" w:type="dxa"/>
+              <w:right w:w="100" w:type="dxa"/>
+            </w:tcMar>
+          </w:tcPr>
+          <w:p>
+            <w:pPr>
+              <w:spacing w:after="0" w:line="240" w:lineRule="auto"/>
+              <w:rPr/>
+            </w:pPr>
+            <w:r>
+              <w:rPr>
+                <w:color w:val="222222"/>
+                <w:sz w:val="18"/>
+                <w:szCs w:val="18"/>
+                <w:rtl w:val="0"/>
+              </w:rPr>
+              <w:t xml:space="preserve">Detectado, sin discriminación</w:t>
+            </w:r>
+          </w:p>
+        </w:tc>
+      </w:tr>
+    </w:tbl>
+    <w:p>
+      <w:pPr>
+        <w:pStyle w:val="normal1"/>
+        <w:spacing w:lineRule="auto" w:line="240" w:before="40" w:after="220"/>
+        <w:jc w:val="center"/>
+        <w:rPr>
+          <w:i/>
+          <w:iCs/>
+          <w:color w:val="555555"/>
+          <w:sz w:val="18"/>
+          <w:szCs w:val="18"/>
+        </w:rPr>
+      </w:pPr>
+      <w:r>
+        <w:rPr>
+          <w:i/>
+          <w:iCs/>
+          <w:color w:val="555555"/>
+          <w:sz w:val="18"/>
+          <w:szCs w:val="18"/>
+        </w:rPr>
+        <w:t xml:space="preserve">Tabla 8. Validación sobre vulnerabilidades documentadas del ecosistema npm (6 casos).</w:t>
+      </w:r>
+    </w:p>
+    <w:p>
+      <w:pPr>
+        <w:pStyle w:val="normal1"/>
+        <w:spacing w:lineRule="auto" w:line="276" w:before="0" w:after="150"/>
+        <w:jc w:val="both"/>
+        <w:rPr/>
+      </w:pPr>
+      <w:r>
+        <w:rPr/>
+        <w:t xml:space="preserve">El sistema detectó uno de los seis casos (16,7 %) y ninguno con discriminación: el único hallazgo, en DOMPurify, se mantiene en la versión corregida, por lo que no corresponde a la vulnerabilidad reportada. El análisis de los casos explica el resultado. En dos paquetes, @hypequery/clickhouse y defuddle, el registro de npm solo contiene código compilado en la carpeta dist, que el evaluador excluye por tratarse de código generado; como verificación complementaria se analizó también esa carpeta, sin cambios en la conclusión: ningún hallazgo en el primero y tres hallazgos idénticos en ambas versiones del segundo. El paquete de @anthropic-ai/claude-code publica únicamente un envoltorio de instalación. En cuanto a la naturaleza de las fallas, las de sanitize-html y DOMPurify residen en la lógica interna de esas bibliotecas de saneamiento, como la validación incompleta de esquemas de URI o la eliminación de nodos del documento, y consisten en omisiones de sus propias reglas de filtrado; la de @hypequery/clickhouse es un error en su función de escapado de parámetros; la de defuddle consiste en interpolar atributos sin escapar al construir HTML como texto, una operación que el catálogo no registra como destino sensible; y la de inyección de comandos se origina en una confusión de rutas que habilita el escape del entorno aislado. Ninguna adopta la forma de un recorrido desde una entrada no confiable hasta una operación sensible del catálogo, que es la clase de vulnerabilidad que el modelo de accesibilidad detecta.</w:t>
+      </w:r>
+    </w:p>
+    <w:p>
+      <w:pPr>
+        <w:pStyle w:val="normal1"/>
+        <w:spacing w:lineRule="auto" w:line="276" w:before="0" w:after="150"/>
+        <w:jc w:val="both"/>
+        <w:rPr/>
+      </w:pPr>
+      <w:r>
+        <w:rPr/>
+        <w:t xml:space="preserve">En consecuencia, esta validación no permite afirmar la efectividad del sistema sobre código real, y tampoco la refuta: el corpus se compone de bibliotecas cuyas fallas quedan fuera del modelo de amenaza del analizador. La validación pendiente debe orientarse a aplicaciones que reciben entradas de usuario y las conducen hacia bases de datos, procesos del sistema o el documento, que es el escenario para el que la herramienta fue diseñada, y ampliar la cantidad de casos hasta admitir conclusiones cuantitativas.</w:t>
       </w:r>
     </w:p>
     <w:p>
@@ -12558,11 +14150,11 @@
           <w:b/>
           <w:bCs/>
         </w:rPr>
-        <w:t xml:space="preserve">Granularidad del análisis. </w:t>
-      </w:r>
-      <w:r>
-        <w:rPr/>
-        <w:t>El procesamiento se encuentra acotado a fragmentos de código o archivos individuales. El análisis de proyectos completos con múltiples archivos no forma parte del estado actual del desarrollo.</w:t>
+        <w:t xml:space="preserve">Alcance del análisis entre archivos. </w:t>
+      </w:r>
+      <w:r>
+        <w:rPr/>
+        <w:t>El dato se sigue de un archivo a otro cuando un archivo invoca una función declarada con function en otro archivo del proyecto e importada mediante import de módulos ES con ruta relativa. No se siguen las importaciones mediante require, las funciones flecha o asignadas a constantes, los métodos de clase, los alias de rutas de TypeScript ni los paquetes de terceros; en esos casos cada archivo se analiza por separado. Por la misma razón, las aplicaciones organizadas en clases o con funciones flecha, habituales en Express y NestJS, quedan cubiertas de forma parcial.</w:t>
       </w:r>
     </w:p>
     <w:p>
@@ -13108,7 +14700,7 @@
                 <w:sz w:val="18"/>
                 <w:szCs w:val="18"/>
               </w:rPr>
-              <w:t>ts-morph</w:t>
+              <w:t xml:space="preserve">Web Workers</w:t>
             </w:r>
           </w:p>
         </w:tc>
@@ -13139,7 +14731,7 @@
                 <w:sz w:val="18"/>
                 <w:szCs w:val="18"/>
               </w:rPr>
-              <w:t>23.0</w:t>
+              <w:t xml:space="preserve">—</w:t>
             </w:r>
           </w:p>
         </w:tc>
@@ -13170,7 +14762,7 @@
                 <w:sz w:val="18"/>
                 <w:szCs w:val="18"/>
               </w:rPr>
-              <w:t>Análisis sintáctico</w:t>
+              <w:t xml:space="preserve">Ejecución</w:t>
             </w:r>
           </w:p>
         </w:tc>
@@ -13201,7 +14793,7 @@
                 <w:sz w:val="18"/>
                 <w:szCs w:val="18"/>
               </w:rPr>
-              <w:t>Generación y recorrido del AST</w:t>
+              <w:t xml:space="preserve">Análisis en segundo plano en el navegador</w:t>
             </w:r>
           </w:p>
         </w:tc>
@@ -13239,7 +14831,7 @@
                 <w:sz w:val="18"/>
                 <w:szCs w:val="18"/>
               </w:rPr>
-              <w:t>Cytoscape.js</w:t>
+              <w:t>ts-morph</w:t>
             </w:r>
           </w:p>
         </w:tc>
@@ -13270,7 +14862,7 @@
                 <w:sz w:val="18"/>
                 <w:szCs w:val="18"/>
               </w:rPr>
-              <w:t>3.30</w:t>
+              <w:t>23.0</w:t>
             </w:r>
           </w:p>
         </w:tc>
@@ -13301,7 +14893,7 @@
                 <w:sz w:val="18"/>
                 <w:szCs w:val="18"/>
               </w:rPr>
-              <w:t>Visualización</w:t>
+              <w:t>Análisis sintáctico</w:t>
             </w:r>
           </w:p>
         </w:tc>
@@ -13332,7 +14924,7 @@
                 <w:sz w:val="18"/>
                 <w:szCs w:val="18"/>
               </w:rPr>
-              <w:t>Renderizado interactivo del grafo</w:t>
+              <w:t>Generación y recorrido del AST</w:t>
             </w:r>
           </w:p>
         </w:tc>
@@ -13370,7 +14962,7 @@
                 <w:sz w:val="18"/>
                 <w:szCs w:val="18"/>
               </w:rPr>
-              <w:t>Vite</w:t>
+              <w:t>Cytoscape.js</w:t>
             </w:r>
           </w:p>
         </w:tc>
@@ -13401,7 +14993,7 @@
                 <w:sz w:val="18"/>
                 <w:szCs w:val="18"/>
               </w:rPr>
-              <w:t>5.4</w:t>
+              <w:t>3.30</w:t>
             </w:r>
           </w:p>
         </w:tc>
@@ -13432,7 +15024,7 @@
                 <w:sz w:val="18"/>
                 <w:szCs w:val="18"/>
               </w:rPr>
-              <w:t>Construcción</w:t>
+              <w:t>Visualización</w:t>
             </w:r>
           </w:p>
         </w:tc>
@@ -13463,7 +15055,7 @@
                 <w:sz w:val="18"/>
                 <w:szCs w:val="18"/>
               </w:rPr>
-              <w:t>Empaquetado y servidor de desarrollo</w:t>
+              <w:t>Renderizado interactivo del grafo</w:t>
             </w:r>
           </w:p>
         </w:tc>
@@ -13501,7 +15093,7 @@
                 <w:sz w:val="18"/>
                 <w:szCs w:val="18"/>
               </w:rPr>
-              <w:t>Vitest</w:t>
+              <w:t>Vite</w:t>
             </w:r>
           </w:p>
         </w:tc>
@@ -13532,7 +15124,7 @@
                 <w:sz w:val="18"/>
                 <w:szCs w:val="18"/>
               </w:rPr>
-              <w:t>2.0</w:t>
+              <w:t>5.4</w:t>
             </w:r>
           </w:p>
         </w:tc>
@@ -13563,7 +15155,7 @@
                 <w:sz w:val="18"/>
                 <w:szCs w:val="18"/>
               </w:rPr>
-              <w:t>Pruebas</w:t>
+              <w:t>Construcción</w:t>
             </w:r>
           </w:p>
         </w:tc>
@@ -13594,7 +15186,7 @@
                 <w:sz w:val="18"/>
                 <w:szCs w:val="18"/>
               </w:rPr>
-              <w:t>Ejecución de la suite automatizada</w:t>
+              <w:t>Empaquetado y servidor de desarrollo</w:t>
             </w:r>
           </w:p>
         </w:tc>
@@ -13632,7 +15224,7 @@
                 <w:sz w:val="18"/>
                 <w:szCs w:val="18"/>
               </w:rPr>
-              <w:t>npm workspaces</w:t>
+              <w:t>Vitest</w:t>
             </w:r>
           </w:p>
         </w:tc>
@@ -13663,7 +15255,7 @@
                 <w:sz w:val="18"/>
                 <w:szCs w:val="18"/>
               </w:rPr>
-              <w:t>—</w:t>
+              <w:t>2.0</w:t>
             </w:r>
           </w:p>
         </w:tc>
@@ -13694,7 +15286,7 @@
                 <w:sz w:val="18"/>
                 <w:szCs w:val="18"/>
               </w:rPr>
-              <w:t>Estructura</w:t>
+              <w:t>Pruebas</w:t>
             </w:r>
           </w:p>
         </w:tc>
@@ -13725,7 +15317,7 @@
                 <w:sz w:val="18"/>
                 <w:szCs w:val="18"/>
               </w:rPr>
-              <w:t>Gestión del monorepo</w:t>
+              <w:t>Ejecución de la suite automatizada</w:t>
             </w:r>
           </w:p>
         </w:tc>
@@ -13763,7 +15355,7 @@
                 <w:sz w:val="18"/>
                 <w:szCs w:val="18"/>
               </w:rPr>
-              <w:t>Neo4j</w:t>
+              <w:t>npm workspaces</w:t>
             </w:r>
           </w:p>
         </w:tc>
@@ -13794,7 +15386,7 @@
                 <w:sz w:val="18"/>
                 <w:szCs w:val="18"/>
               </w:rPr>
-              <w:t>5 Community</w:t>
+              <w:t>—</w:t>
             </w:r>
           </w:p>
         </w:tc>
@@ -13825,7 +15417,7 @@
                 <w:sz w:val="18"/>
                 <w:szCs w:val="18"/>
               </w:rPr>
-              <w:t>Persistencia</w:t>
+              <w:t>Estructura</w:t>
             </w:r>
           </w:p>
         </w:tc>
@@ -13856,7 +15448,7 @@
                 <w:sz w:val="18"/>
                 <w:szCs w:val="18"/>
               </w:rPr>
-              <w:t>Almacenamiento del grafo compilado</w:t>
+              <w:t>Gestión del monorepo</w:t>
             </w:r>
           </w:p>
         </w:tc>
@@ -13894,7 +15486,7 @@
                 <w:sz w:val="18"/>
                 <w:szCs w:val="18"/>
               </w:rPr>
-              <w:t>neo4j-driver</w:t>
+              <w:t>Neo4j</w:t>
             </w:r>
           </w:p>
         </w:tc>
@@ -13925,7 +15517,7 @@
                 <w:sz w:val="18"/>
                 <w:szCs w:val="18"/>
               </w:rPr>
-              <w:t>6.2</w:t>
+              <w:t>5 Community</w:t>
             </w:r>
           </w:p>
         </w:tc>
@@ -13987,7 +15579,7 @@
                 <w:sz w:val="18"/>
                 <w:szCs w:val="18"/>
               </w:rPr>
-              <w:t>Cliente Bolt y ejecución de consultas Cypher</w:t>
+              <w:t>Almacenamiento del grafo compilado</w:t>
             </w:r>
           </w:p>
         </w:tc>
@@ -14025,7 +15617,7 @@
                 <w:sz w:val="18"/>
                 <w:szCs w:val="18"/>
               </w:rPr>
-              <w:t>Docker Compose</w:t>
+              <w:t>neo4j-driver</w:t>
             </w:r>
           </w:p>
         </w:tc>
@@ -14056,7 +15648,7 @@
                 <w:sz w:val="18"/>
                 <w:szCs w:val="18"/>
               </w:rPr>
-              <w:t>—</w:t>
+              <w:t>6.2</w:t>
             </w:r>
           </w:p>
         </w:tc>
@@ -14087,7 +15679,7 @@
                 <w:sz w:val="18"/>
                 <w:szCs w:val="18"/>
               </w:rPr>
-              <w:t>Entorno</w:t>
+              <w:t>Persistencia</w:t>
             </w:r>
           </w:p>
         </w:tc>
@@ -14118,7 +15710,269 @@
                 <w:sz w:val="18"/>
                 <w:szCs w:val="18"/>
               </w:rPr>
+              <w:t>Cliente Bolt y ejecución de consultas Cypher</w:t>
+            </w:r>
+          </w:p>
+        </w:tc>
+      </w:tr>
+      <w:tr>
+        <w:trPr/>
+        <w:tc>
+          <w:tcPr>
+            <w:tcW w:w="2100" w:type="dxa"/>
+            <w:tcBorders>
+              <w:top w:val="single" w:sz="4" w:space="0" w:color="CCCCCC"/>
+              <w:left w:val="single" w:sz="4" w:space="0" w:color="CCCCCC"/>
+              <w:bottom w:val="single" w:sz="4" w:space="0" w:color="CCCCCC"/>
+              <w:right w:val="single" w:sz="4" w:space="0" w:color="CCCCCC"/>
+            </w:tcBorders>
+            <w:shd w:fill="EAF1F8" w:val="clear"/>
+          </w:tcPr>
+          <w:p>
+            <w:pPr>
+              <w:pStyle w:val="normal1"/>
+              <w:spacing w:lineRule="auto" w:line="240" w:before="0" w:after="0"/>
+              <w:rPr>
+                <w:b/>
+                <w:bCs/>
+                <w:color w:val="1F3A5F"/>
+                <w:sz w:val="18"/>
+                <w:szCs w:val="18"/>
+              </w:rPr>
+            </w:pPr>
+            <w:r>
+              <w:rPr>
+                <w:b/>
+                <w:bCs/>
+                <w:color w:val="1F3A5F"/>
+                <w:sz w:val="18"/>
+                <w:szCs w:val="18"/>
+              </w:rPr>
+              <w:t>Docker Compose</w:t>
+            </w:r>
+          </w:p>
+        </w:tc>
+        <w:tc>
+          <w:tcPr>
+            <w:tcW w:w="1200" w:type="dxa"/>
+            <w:tcBorders>
+              <w:top w:val="single" w:sz="4" w:space="0" w:color="CCCCCC"/>
+              <w:left w:val="single" w:sz="4" w:space="0" w:color="CCCCCC"/>
+              <w:bottom w:val="single" w:sz="4" w:space="0" w:color="CCCCCC"/>
+              <w:right w:val="single" w:sz="4" w:space="0" w:color="CCCCCC"/>
+            </w:tcBorders>
+            <w:shd w:fill="FFFFFF" w:val="clear"/>
+          </w:tcPr>
+          <w:p>
+            <w:pPr>
+              <w:pStyle w:val="normal1"/>
+              <w:spacing w:lineRule="auto" w:line="240" w:before="0" w:after="0"/>
+              <w:rPr>
+                <w:color w:val="222222"/>
+                <w:sz w:val="18"/>
+                <w:szCs w:val="18"/>
+              </w:rPr>
+            </w:pPr>
+            <w:r>
+              <w:rPr>
+                <w:color w:val="222222"/>
+                <w:sz w:val="18"/>
+                <w:szCs w:val="18"/>
+              </w:rPr>
+              <w:t>—</w:t>
+            </w:r>
+          </w:p>
+        </w:tc>
+        <w:tc>
+          <w:tcPr>
+            <w:tcW w:w="2560" w:type="dxa"/>
+            <w:tcBorders>
+              <w:top w:val="single" w:sz="4" w:space="0" w:color="CCCCCC"/>
+              <w:left w:val="single" w:sz="4" w:space="0" w:color="CCCCCC"/>
+              <w:bottom w:val="single" w:sz="4" w:space="0" w:color="CCCCCC"/>
+              <w:right w:val="single" w:sz="4" w:space="0" w:color="CCCCCC"/>
+            </w:tcBorders>
+            <w:shd w:fill="FFFFFF" w:val="clear"/>
+          </w:tcPr>
+          <w:p>
+            <w:pPr>
+              <w:pStyle w:val="normal1"/>
+              <w:spacing w:lineRule="auto" w:line="240" w:before="0" w:after="0"/>
+              <w:rPr>
+                <w:color w:val="222222"/>
+                <w:sz w:val="18"/>
+                <w:szCs w:val="18"/>
+              </w:rPr>
+            </w:pPr>
+            <w:r>
+              <w:rPr>
+                <w:color w:val="222222"/>
+                <w:sz w:val="18"/>
+                <w:szCs w:val="18"/>
+              </w:rPr>
+              <w:t>Entorno</w:t>
+            </w:r>
+          </w:p>
+        </w:tc>
+        <w:tc>
+          <w:tcPr>
+            <w:tcW w:w="3500" w:type="dxa"/>
+            <w:tcBorders>
+              <w:top w:val="single" w:sz="4" w:space="0" w:color="CCCCCC"/>
+              <w:left w:val="single" w:sz="4" w:space="0" w:color="CCCCCC"/>
+              <w:bottom w:val="single" w:sz="4" w:space="0" w:color="CCCCCC"/>
+              <w:right w:val="single" w:sz="4" w:space="0" w:color="CCCCCC"/>
+            </w:tcBorders>
+            <w:shd w:fill="FFFFFF" w:val="clear"/>
+          </w:tcPr>
+          <w:p>
+            <w:pPr>
+              <w:pStyle w:val="normal1"/>
+              <w:spacing w:lineRule="auto" w:line="240" w:before="0" w:after="0"/>
+              <w:rPr>
+                <w:color w:val="222222"/>
+                <w:sz w:val="18"/>
+                <w:szCs w:val="18"/>
+              </w:rPr>
+            </w:pPr>
+            <w:r>
+              <w:rPr>
+                <w:color w:val="222222"/>
+                <w:sz w:val="18"/>
+                <w:szCs w:val="18"/>
+              </w:rPr>
               <w:t>Provisión local de la instancia de Neo4j</w:t>
+            </w:r>
+          </w:p>
+        </w:tc>
+      </w:tr>
+      <w:tr>
+        <w:trPr/>
+        <w:tc>
+          <w:tcPr>
+            <w:tcW w:w="2100" w:type="dxa"/>
+            <w:tcBorders>
+              <w:top w:val="single" w:sz="4" w:space="0" w:color="CCCCCC"/>
+              <w:left w:val="single" w:sz="4" w:space="0" w:color="CCCCCC"/>
+              <w:bottom w:val="single" w:sz="4" w:space="0" w:color="CCCCCC"/>
+              <w:right w:val="single" w:sz="4" w:space="0" w:color="CCCCCC"/>
+            </w:tcBorders>
+            <w:shd w:fill="EAF1F8" w:val="clear"/>
+          </w:tcPr>
+          <w:p>
+            <w:pPr>
+              <w:pStyle w:val="normal1"/>
+              <w:spacing w:lineRule="auto" w:line="240" w:before="0" w:after="0"/>
+              <w:rPr>
+                <w:b/>
+                <w:bCs/>
+                <w:color w:val="1F3A5F"/>
+                <w:sz w:val="18"/>
+                <w:szCs w:val="18"/>
+              </w:rPr>
+            </w:pPr>
+            <w:r>
+              <w:rPr>
+                <w:b/>
+                <w:bCs/>
+                <w:color w:val="1F3A5F"/>
+                <w:sz w:val="18"/>
+                <w:szCs w:val="18"/>
+              </w:rPr>
+              <w:t xml:space="preserve">Vercel</w:t>
+            </w:r>
+          </w:p>
+        </w:tc>
+        <w:tc>
+          <w:tcPr>
+            <w:tcW w:w="1200" w:type="dxa"/>
+            <w:tcBorders>
+              <w:top w:val="single" w:sz="4" w:space="0" w:color="CCCCCC"/>
+              <w:left w:val="single" w:sz="4" w:space="0" w:color="CCCCCC"/>
+              <w:bottom w:val="single" w:sz="4" w:space="0" w:color="CCCCCC"/>
+              <w:right w:val="single" w:sz="4" w:space="0" w:color="CCCCCC"/>
+            </w:tcBorders>
+            <w:shd w:fill="FFFFFF" w:val="clear"/>
+          </w:tcPr>
+          <w:p>
+            <w:pPr>
+              <w:pStyle w:val="normal1"/>
+              <w:spacing w:lineRule="auto" w:line="240" w:before="0" w:after="0"/>
+              <w:rPr>
+                <w:color w:val="222222"/>
+                <w:sz w:val="18"/>
+                <w:szCs w:val="18"/>
+              </w:rPr>
+            </w:pPr>
+            <w:r>
+              <w:rPr>
+                <w:color w:val="222222"/>
+                <w:sz w:val="18"/>
+                <w:szCs w:val="18"/>
+              </w:rPr>
+              <w:t xml:space="preserve">—</w:t>
+            </w:r>
+          </w:p>
+        </w:tc>
+        <w:tc>
+          <w:tcPr>
+            <w:tcW w:w="2560" w:type="dxa"/>
+            <w:tcBorders>
+              <w:top w:val="single" w:sz="4" w:space="0" w:color="CCCCCC"/>
+              <w:left w:val="single" w:sz="4" w:space="0" w:color="CCCCCC"/>
+              <w:bottom w:val="single" w:sz="4" w:space="0" w:color="CCCCCC"/>
+              <w:right w:val="single" w:sz="4" w:space="0" w:color="CCCCCC"/>
+            </w:tcBorders>
+            <w:shd w:fill="FFFFFF" w:val="clear"/>
+          </w:tcPr>
+          <w:p>
+            <w:pPr>
+              <w:pStyle w:val="normal1"/>
+              <w:spacing w:lineRule="auto" w:line="240" w:before="0" w:after="0"/>
+              <w:rPr>
+                <w:color w:val="222222"/>
+                <w:sz w:val="18"/>
+                <w:szCs w:val="18"/>
+              </w:rPr>
+            </w:pPr>
+            <w:r>
+              <w:rPr>
+                <w:color w:val="222222"/>
+                <w:sz w:val="18"/>
+                <w:szCs w:val="18"/>
+              </w:rPr>
+              <w:t xml:space="preserve">Despliegue</w:t>
+            </w:r>
+          </w:p>
+        </w:tc>
+        <w:tc>
+          <w:tcPr>
+            <w:tcW w:w="3500" w:type="dxa"/>
+            <w:tcBorders>
+              <w:top w:val="single" w:sz="4" w:space="0" w:color="CCCCCC"/>
+              <w:left w:val="single" w:sz="4" w:space="0" w:color="CCCCCC"/>
+              <w:bottom w:val="single" w:sz="4" w:space="0" w:color="CCCCCC"/>
+              <w:right w:val="single" w:sz="4" w:space="0" w:color="CCCCCC"/>
+            </w:tcBorders>
+            <w:shd w:fill="FFFFFF" w:val="clear"/>
+          </w:tcPr>
+          <w:p>
+            <w:pPr>
+              <w:pStyle w:val="normal1"/>
+              <w:spacing w:lineRule="auto" w:line="240" w:before="0" w:after="0"/>
+              <w:rPr>
+                <w:color w:val="222222"/>
+                <w:sz w:val="18"/>
+                <w:szCs w:val="18"/>
+              </w:rPr>
+            </w:pPr>
+            <w:r>
+              <w:rPr>
+                <w:color w:val="222222"/>
+                <w:sz w:val="18"/>
+                <w:szCs w:val="18"/>
+              </w:rPr>
+              <w:t xml:space="preserve">Publicación de la aplicación web como sitio estático</w:t>
             </w:r>
           </w:p>
         </w:tc>
@@ -14155,7 +16009,7 @@
           <w:sz w:val="18"/>
           <w:szCs w:val="18"/>
         </w:rPr>
-        <w:t>Tabla 8. Tecnologías empleadas en el desarrollo del prototipo.</w:t>
+        <w:t>Tabla 9. Tecnologías empleadas en el desarrollo del prototipo.</w:t>
       </w:r>
     </w:p>
     <w:p>
@@ -14337,7 +16191,7 @@
       </w:pPr>
       <w:r>
         <w:rPr/>
-        <w:t>La ejecución requiere únicamente un entorno con Node.js instalado y un navegador web. No se requiere hardware especializado, servicios de terceros ni infraestructura de servidores. El desarrollo y las pruebas se realizaron sobre un equipo de escritorio de características estándar.</w:t>
+        <w:t>La versión web requiere únicamente un navegador actualizado; la interfaz de línea de comandos requiere un entorno con Node.js. No se requiere hardware especializado, servicios de terceros ni infraestructura de servidores. El desarrollo y las pruebas se realizaron sobre un equipo de escritorio de características estándar.</w:t>
       </w:r>
     </w:p>
     <w:p>
@@ -14879,7 +16733,7 @@
           <w:sz w:val="18"/>
           <w:szCs w:val="18"/>
         </w:rPr>
-        <w:t>Tabla 9. Categorías de nodo del modelo de grafo.</w:t>
+        <w:t>Tabla 10. Categorías de nodo del modelo de grafo.</w:t>
       </w:r>
     </w:p>
     <w:p>
@@ -15373,7 +17227,7 @@
           <w:sz w:val="18"/>
           <w:szCs w:val="18"/>
         </w:rPr>
-        <w:t>Tabla 10. Categorías de relación del modelo de grafo.</w:t>
+        <w:t>Tabla 11. Categorías de relación del modelo de grafo.</w:t>
       </w:r>
     </w:p>
     <w:p>
@@ -15423,7 +17277,7 @@
         <w:rPr>
           <w:rtl w:val="0"/>
         </w:rPr>
-        <w:t xml:space="preserve">Durante la implementación de las consultas Cypher sobre Neo4j surgió una dificultad concreta con las llamadas recursivas o cíclicas entre funciones, que generaban recorridos de longitud indefinida y demoraban el motor. Para resolverlo se acotó la profundidad de búsqueda a quince saltos entre el origen y el destino. En el recorrido en memoria ese límite es el valor por defecto de un parámetro configurable, mientras que en la consulta Cypher queda fijado en el patrón de camino. La restricción evita los recorridos indefinidos sin comprometer la detección en los flujos habituales de una aplicación web: en la validación sobre el corpus de prueba de 33 casos, el análisis completo demandó alrededor de 212 ms, aproximadamente 1,5 ms por línea de código.</w:t>
+        <w:t xml:space="preserve">Durante la implementación de las consultas Cypher sobre Neo4j surgió una dificultad concreta con las llamadas recursivas o cíclicas entre funciones, que generaban recorridos de longitud indefinida y demoraban el motor. Para resolverlo se acotó la profundidad de búsqueda a quince saltos entre el origen y el destino. En el recorrido en memoria ese límite es el valor por defecto de un parámetro configurable, mientras que en la consulta Cypher queda fijado en el patrón de camino. La restricción evita los recorridos indefinidos sin comprometer la detección en los flujos habituales de una aplicación web: sobre el banco de pruebas de 43 casos, el análisis completo demandó alrededor de 52 ms, aproximadamente 0,27 ms por línea de código (Tabla 7).</w:t>
       </w:r>
     </w:p>
     <w:p>
@@ -15483,7 +17337,80 @@
       </w:pPr>
       <w:r>
         <w:rPr/>
-        <w:t>La aplicación se estructura en tres paneles simultáneos. El panel de código permite ingresar el fragmento a analizar mediante un editor de texto o seleccionar uno de los ejemplos precargados, que ilustran distintos escenarios de vulnerabilidad y de saneamiento. El panel central presenta el grafo generado. El panel de hallazgos expone el catálogo de debilidades cubiertas, las reglas activas y los resultados obtenidos. La disposición simultánea responde a un criterio explícito: permitir que el usuario contraste el código, su representación como grafo y los hallazgos sin necesidad de alternar entre vistas.</w:t>
+        <w:t>La aplicación se estructura en tres paneles simultáneos. El panel izquierdo ofrece dos modos. En el modo de proyecto, el usuario elige o arrastra una carpeta o un conjunto de archivos; la aplicación informa cuántos archivos se analizan y por qué se excluyen los demás, muestra el progreso del análisis y, al finalizar, lista los archivos con su cantidad de hallazgos junto con el contenido del archivo elegido y las líneas del camino de riesgo resaltadas (Figura 7). En el modo de ejemplos, el usuario puede ingresar un fragmento mediante un editor de texto o seleccionar uno de los ejemplos precargados, que ilustran distintos escenarios de vulnerabilidad y de saneamiento. El panel central presenta el grafo generado. El panel de hallazgos expone el veredicto, cada hallazgo con su debilidad, su ubicación y su recorrido, el catálogo de debilidades cubiertas y las reglas activas. La disposición simultánea responde a un criterio explícito: permitir que el usuario contraste el código, su representación como grafo y los hallazgos sin necesidad de alternar entre vistas.</w:t>
+      </w:r>
+    </w:p>
+    <w:p>
+      <w:pPr>
+        <w:pStyle w:val="normal1"/>
+        <w:spacing w:before="160" w:after="60"/>
+        <w:jc w:val="center"/>
+        <w:rPr/>
+      </w:pPr>
+      <w:r>
+        <w:rPr/>
+        <w:drawing>
+          <wp:inline distT="0" distB="0" distL="0" distR="0">
+            <wp:extent cx="5619750" cy="3356240"/>
+            <wp:effectExtent l="0" t="0" r="0" b="0"/>
+            <wp:docPr id="8" name="Figura 8"/>
+            <wp:cNvGraphicFramePr>
+              <a:graphicFrameLocks xmlns:a="http://schemas.openxmlformats.org/drawingml/2006/main" noChangeAspect="1"/>
+            </wp:cNvGraphicFramePr>
+            <a:graphic xmlns:a="http://schemas.openxmlformats.org/drawingml/2006/main">
+              <a:graphicData uri="http://schemas.openxmlformats.org/drawingml/2006/picture">
+                <pic:pic xmlns:pic="http://schemas.openxmlformats.org/drawingml/2006/picture">
+                  <pic:nvPicPr>
+                    <pic:cNvPr id="8" name="Figura 8"/>
+                    <pic:cNvPicPr>
+                      <a:picLocks noChangeAspect="1" noChangeArrowheads="1"/>
+                    </pic:cNvPicPr>
+                  </pic:nvPicPr>
+                  <pic:blipFill>
+                    <a:blip r:embed="rId100"/>
+                    <a:stretch>
+                      <a:fillRect/>
+                    </a:stretch>
+                  </pic:blipFill>
+                  <pic:spPr bwMode="auto">
+                    <a:xfrm>
+                      <a:off x="0" y="0"/>
+                      <a:ext cx="5619750" cy="3356240"/>
+                    </a:xfrm>
+                    <a:prstGeom prst="rect">
+                      <a:avLst/>
+                    </a:prstGeom>
+                    <a:noFill/>
+                  </pic:spPr>
+                </pic:pic>
+              </a:graphicData>
+            </a:graphic>
+          </wp:inline>
+        </w:drawing>
+      </w:r>
+    </w:p>
+    <w:p>
+      <w:pPr>
+        <w:pStyle w:val="normal1"/>
+        <w:spacing w:lineRule="auto" w:line="240" w:before="40" w:after="220"/>
+        <w:jc w:val="center"/>
+        <w:rPr>
+          <w:i/>
+          <w:iCs/>
+          <w:color w:val="555555"/>
+          <w:sz w:val="18"/>
+          <w:szCs w:val="18"/>
+        </w:rPr>
+      </w:pPr>
+      <w:r>
+        <w:rPr>
+          <w:i/>
+          <w:iCs/>
+          <w:color w:val="555555"/>
+          <w:sz w:val="18"/>
+          <w:szCs w:val="18"/>
+        </w:rPr>
+        <w:t xml:space="preserve">Figura 7. Versión web: análisis de un proyecto subido como carpeta. El hallazgo cruza tres archivos y se muestra el archivo del sink con las líneas del camino resaltadas.</w:t>
       </w:r>
     </w:p>
     <w:p>
@@ -15531,7 +17458,7 @@
       </w:pPr>
       <w:r>
         <w:rPr/>
-        <w:t>La interfaz señala además de manera explícita el modo de operación del motor mediante un indicador en el encabezado, que distingue si el análisis se resolvió mediante el recorrido en memoria o mediante la consulta Cypher sobre el grafo persistido. Esta decisión responde al criterio de que las condiciones de ejecución y las limitaciones del prototipo resulten visibles para el usuario.</w:t>
+        <w:t>La interfaz señala además de manera explícita el modo de operación del motor mediante un indicador en el encabezado. En la versión web el análisis se resuelve siempre mediante el recorrido en memoria, dado que se ejecuta en el navegador; la consulta Cypher sobre el grafo persistido en Neo4j queda disponible a través de la API local. Esta decisión responde al criterio de que las condiciones de ejecución y las limitaciones del prototipo resulten visibles para el usuario.</w:t>
       </w:r>
     </w:p>
     <w:p>
@@ -16085,7 +18012,7 @@
         <w:rPr>
           <w:rtl w:val="0"/>
         </w:rPr>
-        <w:t xml:space="preserve">Los parámetros de dedicación correspondientes a la fase de prototipo y a las tareas pendientes hasta el lanzamiento se resumen en la Tabla 11.</w:t>
+        <w:t xml:space="preserve">Los parámetros de dedicación correspondientes a la fase de prototipo y a las tareas pendientes hasta el lanzamiento se resumen en la Tabla 12.</w:t>
       </w:r>
     </w:p>
     <w:tbl>
@@ -16539,7 +18466,7 @@
           <w:szCs w:val="18"/>
           <w:rtl w:val="0"/>
         </w:rPr>
-        <w:t xml:space="preserve">Tabla 11. Supuestos de estimación de horas de desarrollo.</w:t>
+        <w:t xml:space="preserve">Tabla 12. Supuestos de estimación de horas de desarrollo.</w:t>
       </w:r>
     </w:p>
     <w:p>
@@ -16602,7 +18529,7 @@
         <w:rPr>
           <w:rtl w:val="0"/>
         </w:rPr>
-        <w:t xml:space="preserve">En la Tabla 12 se detallan las erogaciones previstas para el Año 0.</w:t>
+        <w:t xml:space="preserve">En la Tabla 13 se detallan las erogaciones previstas para el Año 0.</w:t>
       </w:r>
     </w:p>
     <w:tbl>
@@ -17333,7 +19260,7 @@
           <w:szCs w:val="18"/>
           <w:rtl w:val="0"/>
         </w:rPr>
-        <w:t xml:space="preserve">Tabla 12. Presupuesto de inversión inicial (Año 0).</w:t>
+        <w:t xml:space="preserve">Tabla 13. Presupuesto de inversión inicial (Año 0).</w:t>
       </w:r>
     </w:p>
     <w:p>
@@ -18453,7 +20380,7 @@
           <w:szCs w:val="18"/>
           <w:rtl w:val="0"/>
         </w:rPr>
-        <w:t xml:space="preserve">Tabla 13. Costos operativos anuales post-proyecto, en dólares (Años 1 a 5).</w:t>
+        <w:t xml:space="preserve">Tabla 14. Costos operativos anuales post-proyecto, en dólares (Años 1 a 5).</w:t>
       </w:r>
     </w:p>
     <w:p>
@@ -19953,7 +21880,92 @@
           <w:szCs w:val="18"/>
           <w:rtl w:val="0"/>
         </w:rPr>
-        <w:t xml:space="preserve">Tabla 14. Flujo de fondos proyectado, en dólares (Años 0 a 5).</w:t>
+        <w:t xml:space="preserve">Tabla 15. Flujo de fondos proyectado, en dólares (Años 0 a 5).</w:t>
+      </w:r>
+    </w:p>
+    <w:p>
+      <w:pPr>
+        <w:pStyle w:val="normal1"/>
+        <w:spacing w:lineRule="auto" w:line="276" w:before="0" w:after="150"/>
+        <w:jc w:val="both"/>
+        <w:rPr/>
+      </w:pPr>
+      <w:r>
+        <w:rPr/>
+        <w:t xml:space="preserve">La Figura 8 representa el mismo flujo: las barras corresponden al flujo neto de cada año y la línea, al acumulado, que cruza el cero a los 1,94 años.</w:t>
+      </w:r>
+    </w:p>
+    <w:p>
+      <w:pPr>
+        <w:pStyle w:val="normal1"/>
+        <w:spacing w:before="160" w:after="60"/>
+        <w:jc w:val="center"/>
+        <w:rPr/>
+      </w:pPr>
+      <w:r>
+        <w:rPr/>
+        <w:drawing>
+          <wp:inline distT="0" distB="0" distL="0" distR="0">
+            <wp:extent cx="5619750" cy="3044031"/>
+            <wp:effectExtent l="0" t="0" r="0" b="0"/>
+            <wp:docPr id="9" name="Figura 9"/>
+            <wp:cNvGraphicFramePr>
+              <a:graphicFrameLocks xmlns:a="http://schemas.openxmlformats.org/drawingml/2006/main" noChangeAspect="1"/>
+            </wp:cNvGraphicFramePr>
+            <a:graphic xmlns:a="http://schemas.openxmlformats.org/drawingml/2006/main">
+              <a:graphicData uri="http://schemas.openxmlformats.org/drawingml/2006/picture">
+                <pic:pic xmlns:pic="http://schemas.openxmlformats.org/drawingml/2006/picture">
+                  <pic:nvPicPr>
+                    <pic:cNvPr id="9" name="Figura 9"/>
+                    <pic:cNvPicPr>
+                      <a:picLocks noChangeAspect="1" noChangeArrowheads="1"/>
+                    </pic:cNvPicPr>
+                  </pic:nvPicPr>
+                  <pic:blipFill>
+                    <a:blip r:embed="rId101"/>
+                    <a:stretch>
+                      <a:fillRect/>
+                    </a:stretch>
+                  </pic:blipFill>
+                  <pic:spPr bwMode="auto">
+                    <a:xfrm>
+                      <a:off x="0" y="0"/>
+                      <a:ext cx="5619750" cy="3044031"/>
+                    </a:xfrm>
+                    <a:prstGeom prst="rect">
+                      <a:avLst/>
+                    </a:prstGeom>
+                    <a:noFill/>
+                  </pic:spPr>
+                </pic:pic>
+              </a:graphicData>
+            </a:graphic>
+          </wp:inline>
+        </w:drawing>
+      </w:r>
+    </w:p>
+    <w:p>
+      <w:pPr>
+        <w:pStyle w:val="normal1"/>
+        <w:spacing w:lineRule="auto" w:line="240" w:before="40" w:after="220"/>
+        <w:jc w:val="center"/>
+        <w:rPr>
+          <w:i/>
+          <w:iCs/>
+          <w:color w:val="555555"/>
+          <w:sz w:val="18"/>
+          <w:szCs w:val="18"/>
+        </w:rPr>
+      </w:pPr>
+      <w:r>
+        <w:rPr>
+          <w:i/>
+          <w:iCs/>
+          <w:color w:val="555555"/>
+          <w:sz w:val="18"/>
+          <w:szCs w:val="18"/>
+        </w:rPr>
+        <w:t xml:space="preserve">Figura 8. Flujo de fondos neto y acumulado, en dólares (Años 0 a 5). El acumulado se vuelve positivo a los 1,94 años.</w:t>
       </w:r>
     </w:p>
     <w:p>
@@ -20082,7 +22094,7 @@
         <w:rPr>
           <w:rtl w:val="0"/>
         </w:rPr>
-        <w:t xml:space="preserve">A partir del flujo de fondos de la Tabla 14, y aplicando la tasa de descuento del 20 %, se obtuvieron los indicadores que expone la Tabla 15.</w:t>
+        <w:t xml:space="preserve">A partir del flujo de fondos de la Tabla 15, y aplicando la tasa de descuento del 20 %, se obtuvieron los indicadores que expone la Tabla 16.</w:t>
       </w:r>
     </w:p>
     <w:tbl>
@@ -20696,7 +22708,7 @@
           <w:szCs w:val="18"/>
           <w:rtl w:val="0"/>
         </w:rPr>
-        <w:t xml:space="preserve">Tabla 15. Resultados de los indicadores financieros.</w:t>
+        <w:t xml:space="preserve">Tabla 16. Resultados de los indicadores financieros.</w:t>
       </w:r>
     </w:p>
     <w:p>
@@ -20833,7 +22845,7 @@
         <w:rPr>
           <w:rtl w:val="0"/>
         </w:rPr>
-        <w:t xml:space="preserve">En la Tabla 16 se evalúa la respuesta del Valor Actual Neto ante incrementos sucesivos de la tasa de corte exigida, entre el 10 % y el 40 % anual.</w:t>
+        <w:t xml:space="preserve">En la Tabla 17 se evalúa la respuesta del Valor Actual Neto ante incrementos sucesivos de la tasa de corte exigida, entre el 10 % y el 40 % anual.</w:t>
       </w:r>
     </w:p>
     <w:tbl>
@@ -21287,7 +23299,7 @@
           <w:szCs w:val="18"/>
           <w:rtl w:val="0"/>
         </w:rPr>
-        <w:t xml:space="preserve">Tabla 16. Sensibilidad del Valor Actual Neto frente a variaciones en la tasa de descuento.</w:t>
+        <w:t xml:space="preserve">Tabla 17. Sensibilidad del Valor Actual Neto frente a variaciones en la tasa de descuento.</w:t>
       </w:r>
     </w:p>
     <w:p>
@@ -21305,6 +23317,79 @@
     </w:p>
     <w:p>
       <w:pPr>
+        <w:pStyle w:val="normal1"/>
+        <w:spacing w:before="160" w:after="60"/>
+        <w:jc w:val="center"/>
+        <w:rPr/>
+      </w:pPr>
+      <w:r>
+        <w:rPr/>
+        <w:drawing>
+          <wp:inline distT="0" distB="0" distL="0" distR="0">
+            <wp:extent cx="5619750" cy="3090862"/>
+            <wp:effectExtent l="0" t="0" r="0" b="0"/>
+            <wp:docPr id="10" name="Figura 10"/>
+            <wp:cNvGraphicFramePr>
+              <a:graphicFrameLocks xmlns:a="http://schemas.openxmlformats.org/drawingml/2006/main" noChangeAspect="1"/>
+            </wp:cNvGraphicFramePr>
+            <a:graphic xmlns:a="http://schemas.openxmlformats.org/drawingml/2006/main">
+              <a:graphicData uri="http://schemas.openxmlformats.org/drawingml/2006/picture">
+                <pic:pic xmlns:pic="http://schemas.openxmlformats.org/drawingml/2006/picture">
+                  <pic:nvPicPr>
+                    <pic:cNvPr id="10" name="Figura 10"/>
+                    <pic:cNvPicPr>
+                      <a:picLocks noChangeAspect="1" noChangeArrowheads="1"/>
+                    </pic:cNvPicPr>
+                  </pic:nvPicPr>
+                  <pic:blipFill>
+                    <a:blip r:embed="rId102"/>
+                    <a:stretch>
+                      <a:fillRect/>
+                    </a:stretch>
+                  </pic:blipFill>
+                  <pic:spPr bwMode="auto">
+                    <a:xfrm>
+                      <a:off x="0" y="0"/>
+                      <a:ext cx="5619750" cy="3090862"/>
+                    </a:xfrm>
+                    <a:prstGeom prst="rect">
+                      <a:avLst/>
+                    </a:prstGeom>
+                    <a:noFill/>
+                  </pic:spPr>
+                </pic:pic>
+              </a:graphicData>
+            </a:graphic>
+          </wp:inline>
+        </w:drawing>
+      </w:r>
+    </w:p>
+    <w:p>
+      <w:pPr>
+        <w:pStyle w:val="normal1"/>
+        <w:spacing w:lineRule="auto" w:line="240" w:before="40" w:after="220"/>
+        <w:jc w:val="center"/>
+        <w:rPr>
+          <w:i/>
+          <w:iCs/>
+          <w:color w:val="555555"/>
+          <w:sz w:val="18"/>
+          <w:szCs w:val="18"/>
+        </w:rPr>
+      </w:pPr>
+      <w:r>
+        <w:rPr>
+          <w:i/>
+          <w:iCs/>
+          <w:color w:val="555555"/>
+          <w:sz w:val="18"/>
+          <w:szCs w:val="18"/>
+        </w:rPr>
+        <w:t xml:space="preserve">Figura 9. Valor Actual Neto según la tasa de descuento anual.</w:t>
+      </w:r>
+    </w:p>
+    <w:p>
+      <w:pPr>
         <w:pStyle w:val="Heading2"/>
         <w:rPr/>
       </w:pPr>
@@ -21325,7 +23410,7 @@
         <w:rPr>
           <w:rtl w:val="0"/>
         </w:rPr>
-        <w:t xml:space="preserve">Siendo la adopción de usuarios la variable de mayor dispersión, la Tabla 17 modela tres situaciones: pesimista, con la mitad de los usuarios proyectados; base, con la proyección original; y optimista, con un 50 % adicional.</w:t>
+        <w:t xml:space="preserve">Siendo la adopción de usuarios la variable de mayor dispersión, la Tabla 18 modela tres situaciones: pesimista, con la mitad de los usuarios proyectados; base, con la proyección original; y optimista, con un 50 % adicional.</w:t>
       </w:r>
     </w:p>
     <w:tbl>
@@ -21827,7 +23912,7 @@
           <w:szCs w:val="18"/>
           <w:rtl w:val="0"/>
         </w:rPr>
-        <w:t xml:space="preserve">Tabla 17. Evaluación de escenarios sobre la base de usuarios.</w:t>
+        <w:t xml:space="preserve">Tabla 18. Evaluación de escenarios sobre la base de usuarios.</w:t>
       </w:r>
     </w:p>
     <w:p>
@@ -21966,6 +24051,224 @@
           <w:rtl w:val="0"/>
         </w:rPr>
         <w:t xml:space="preserve">Bajo la condición de que la efectividad técnica del análisis sustente la recomendación entre desarrolladores y se sostenga la adopción mínima correspondiente al escenario pesimista, el proyecto se justifica económicamente para su ejecución.</w:t>
+      </w:r>
+    </w:p>
+    <w:p>
+      <w:pPr>
+        <w:pStyle w:val="Heading1"/>
+        <w:rPr/>
+      </w:pPr>
+      <w:bookmarkStart w:id="103" w:name="__RefHeading___Toc2663_3794039968"/>
+      <w:bookmarkStart w:id="104" w:name="_heading=h.vaslfh31bicu"/>
+      <w:bookmarkEnd w:id="103"/>
+      <w:bookmarkEnd w:id="104"/>
+      <w:r>
+        <w:rPr/>
+        <w:t xml:space="preserve">Referencias bibliográficas</w:t>
+      </w:r>
+    </w:p>
+    <w:p>
+      <w:pPr>
+        <w:pStyle w:val="Heading2"/>
+        <w:rPr/>
+      </w:pPr>
+      <w:bookmarkStart w:id="107" w:name="__RefHeading___Toc2779_3794039968"/>
+      <w:bookmarkEnd w:id="107"/>
+      <w:r>
+        <w:rPr/>
+        <w:t xml:space="preserve">Sitios web (consultados el 23 de septiembre de 2026)</w:t>
+      </w:r>
+    </w:p>
+    <w:p>
+      <w:pPr>
+        <w:pStyle w:val="normal1"/>
+        <w:spacing w:lineRule="auto" w:line="276" w:before="0" w:after="150"/>
+        <w:jc w:val="left"/>
+        <w:rPr/>
+      </w:pPr>
+      <w:r>
+        <w:rPr/>
+        <w:t xml:space="preserve">Banco Central de la República Argentina. Tipo de cambio de referencia, Comunicación «A» 3500. https://www.bcra.gob.ar/</w:t>
+      </w:r>
+    </w:p>
+    <w:p>
+      <w:pPr>
+        <w:pStyle w:val="normal1"/>
+        <w:spacing w:lineRule="auto" w:line="276" w:before="0" w:after="150"/>
+        <w:jc w:val="left"/>
+        <w:rPr/>
+      </w:pPr>
+      <w:r>
+        <w:rPr/>
+        <w:t xml:space="preserve">CESSI. Observatorio Permanente de la Industria del Software y Servicios Informáticos (OPSSI). https://www.cessi.org.ar/opssi</w:t>
+      </w:r>
+    </w:p>
+    <w:p>
+      <w:pPr>
+        <w:pStyle w:val="normal1"/>
+        <w:spacing w:lineRule="auto" w:line="276" w:before="0" w:after="150"/>
+        <w:jc w:val="left"/>
+        <w:rPr/>
+      </w:pPr>
+      <w:r>
+        <w:rPr/>
+        <w:t xml:space="preserve">Damodaran, A. Damodaran Online: datos de costo de capital. Stern School of Business, New York University. https://pages.stern.nyu.edu/~adamodar/</w:t>
+      </w:r>
+    </w:p>
+    <w:p>
+      <w:pPr>
+        <w:pStyle w:val="normal1"/>
+        <w:spacing w:lineRule="auto" w:line="276" w:before="0" w:after="150"/>
+        <w:jc w:val="left"/>
+        <w:rPr/>
+      </w:pPr>
+      <w:r>
+        <w:rPr/>
+        <w:t xml:space="preserve">Damodaran, A. Historical Returns for the US. https://pages.stern.nyu.edu/~adamodar/New_Home_Page/datafile/histretSP.html</w:t>
+      </w:r>
+    </w:p>
+    <w:p>
+      <w:pPr>
+        <w:pStyle w:val="normal1"/>
+        <w:spacing w:lineRule="auto" w:line="276" w:before="0" w:after="150"/>
+        <w:jc w:val="left"/>
+        <w:rPr/>
+      </w:pPr>
+      <w:r>
+        <w:rPr/>
+        <w:t xml:space="preserve">Federal Reserve. Why does the Federal Reserve aim for inflation of 2 percent over the longer run? https://www.federalreserve.gov/faqs/economy_14400.htm</w:t>
+      </w:r>
+    </w:p>
+    <w:p>
+      <w:pPr>
+        <w:pStyle w:val="normal1"/>
+        <w:spacing w:lineRule="auto" w:line="276" w:before="0" w:after="150"/>
+        <w:jc w:val="left"/>
+        <w:rPr/>
+      </w:pPr>
+      <w:r>
+        <w:rPr/>
+        <w:t xml:space="preserve">GitHub. GitHub Advisory Database. https://github.com/advisories</w:t>
+      </w:r>
+    </w:p>
+    <w:p>
+      <w:pPr>
+        <w:pStyle w:val="normal1"/>
+        <w:spacing w:lineRule="auto" w:line="276" w:before="0" w:after="150"/>
+        <w:jc w:val="left"/>
+        <w:rPr/>
+      </w:pPr>
+      <w:r>
+        <w:rPr/>
+        <w:t xml:space="preserve">GitHub. Octoverse. https://octoverse.github.com/</w:t>
+      </w:r>
+    </w:p>
+    <w:p>
+      <w:pPr>
+        <w:pStyle w:val="normal1"/>
+        <w:spacing w:lineRule="auto" w:line="276" w:before="0" w:after="150"/>
+        <w:jc w:val="left"/>
+        <w:rPr/>
+      </w:pPr>
+      <w:r>
+        <w:rPr/>
+        <w:t xml:space="preserve">Lemon Squeezy. License API. https://docs.lemonsqueezy.com/help/licensing/license-api</w:t>
+      </w:r>
+    </w:p>
+    <w:p>
+      <w:pPr>
+        <w:pStyle w:val="normal1"/>
+        <w:spacing w:lineRule="auto" w:line="276" w:before="0" w:after="150"/>
+        <w:jc w:val="left"/>
+        <w:rPr/>
+      </w:pPr>
+      <w:r>
+        <w:rPr/>
+        <w:t xml:space="preserve">Lemon Squeezy. Pricing. https://www.lemonsqueezy.com/pricing</w:t>
+      </w:r>
+    </w:p>
+    <w:p>
+      <w:pPr>
+        <w:pStyle w:val="normal1"/>
+        <w:spacing w:lineRule="auto" w:line="276" w:before="0" w:after="150"/>
+        <w:jc w:val="left"/>
+        <w:rPr/>
+      </w:pPr>
+      <w:r>
+        <w:rPr/>
+        <w:t xml:space="preserve">npm. Registro público de paquetes. https://registry.npmjs.org/</w:t>
+      </w:r>
+    </w:p>
+    <w:p>
+      <w:pPr>
+        <w:pStyle w:val="normal1"/>
+        <w:spacing w:lineRule="auto" w:line="276" w:before="0" w:after="150"/>
+        <w:jc w:val="left"/>
+        <w:rPr/>
+      </w:pPr>
+      <w:r>
+        <w:rPr/>
+        <w:t xml:space="preserve">OpenQube. Resultados de la encuesta de sueldos de sysarmy. https://sueldos.openqube.io/</w:t>
+      </w:r>
+    </w:p>
+    <w:p>
+      <w:pPr>
+        <w:pStyle w:val="normal1"/>
+        <w:spacing w:lineRule="auto" w:line="276" w:before="0" w:after="150"/>
+        <w:jc w:val="left"/>
+        <w:rPr/>
+      </w:pPr>
+      <w:r>
+        <w:rPr/>
+        <w:t xml:space="preserve">Paddle. Pricing. https://www.paddle.com/pricing</w:t>
+      </w:r>
+    </w:p>
+    <w:p>
+      <w:pPr>
+        <w:pStyle w:val="normal1"/>
+        <w:spacing w:lineRule="auto" w:line="276" w:before="0" w:after="150"/>
+        <w:jc w:val="left"/>
+        <w:rPr/>
+      </w:pPr>
+      <w:r>
+        <w:rPr/>
+        <w:t xml:space="preserve">SlashData. Developer Nation. https://www.slashdata.co/research/developer-nation</w:t>
+      </w:r>
+    </w:p>
+    <w:p>
+      <w:pPr>
+        <w:pStyle w:val="normal1"/>
+        <w:spacing w:lineRule="auto" w:line="276" w:before="0" w:after="150"/>
+        <w:jc w:val="left"/>
+        <w:rPr/>
+      </w:pPr>
+      <w:r>
+        <w:rPr/>
+        <w:t xml:space="preserve">U.S. Department of the Treasury. Daily Treasury Rates. https://home.treasury.gov/resource-center/data-chart-center/interest-rates/TextView?type=daily_treasury_yield_curve</w:t>
+      </w:r>
+    </w:p>
+    <w:p>
+      <w:pPr>
+        <w:pStyle w:val="normal1"/>
+        <w:spacing w:lineRule="auto" w:line="276" w:before="0" w:after="150"/>
+        <w:jc w:val="left"/>
+        <w:rPr/>
+      </w:pPr>
+      <w:r>
+        <w:rPr/>
+        <w:t xml:space="preserve">Vercel. Fair Use Guidelines. https://vercel.com/docs/limits/fair-use-guidelines</w:t>
+      </w:r>
+    </w:p>
+    <w:p>
+      <w:pPr>
+        <w:pStyle w:val="normal1"/>
+        <w:spacing w:lineRule="auto" w:line="276" w:before="0" w:after="150"/>
+        <w:jc w:val="left"/>
+        <w:rPr/>
+      </w:pPr>
+      <w:r>
+        <w:rPr/>
+        <w:t xml:space="preserve">Vercel. Pricing. https://vercel.com/pricing</w:t>
       </w:r>
     </w:p>
     <w:sectPr>

</xml_diff>

<commit_message>
docs(tesis): figuras 4 a 7 con el rediseño de la interfaz
Co-Authored-By: Claude Opus 5.5 <noreply@anthropic.com>
</commit_message>
<xml_diff>
--- a/docs/GraphSAST.docx
+++ b/docs/GraphSAST.docx
@@ -15264,7 +15264,7 @@
           <mc:Choice Requires="wpg">
             <w:drawing>
               <wp:inline xmlns:wp="http://schemas.openxmlformats.org/drawingml/2006/wordprocessingDrawing" distT="0" distB="0" distL="0" distR="0">
-                <wp:extent cx="2238375" cy="2458872"/>
+                <wp:extent cx="2238375" cy="2566112"/>
                 <wp:effectExtent l="0" t="0" r="0" b="0"/>
                 <wp:docPr id="7" name="Figura 104"/>
                 <wp:cNvGraphicFramePr>
@@ -15287,7 +15287,7 @@
                       <pic:spPr bwMode="auto">
                         <a:xfrm>
                           <a:off x="0" y="0"/>
-                          <a:ext cx="2238375" cy="2458872"/>
+                          <a:ext cx="2238375" cy="2566112"/>
                         </a:xfrm>
                         <a:prstGeom prst="rect">
                           <a:avLst/>

</xml_diff>

<commit_message>
docs: URL de la versión publicada en Vercel
La tesis (despliegue) y el README enlazan https://graph-sast.vercel.app/.
Se verificó sobre el sitio publicado que el análisis funciona y que la
página no hace solicitudes a otros dominios.

Co-Authored-By: Claude Opus 5.5 <noreply@anthropic.com>
</commit_message>
<xml_diff>
--- a/docs/GraphSAST.docx
+++ b/docs/GraphSAST.docx
@@ -22537,10 +22537,10 @@
         <w:rPr/>
       </w:pPr>
       <w:r>
-        <w:t xml:space="preserve">La aplicación web está preparada para publicarse como sitio estático en la plataforma Vercel, que compila el p</w:t>
-      </w:r>
-      <w:r>
-        <w:t xml:space="preserve">royecto a partir del repositorio y sirve los archivos resultantes sin funciones de servidor. Para el desarrollo local, la ejecución requiere la instalación de las dependencias mediante el gestor de paquetes y la puesta en marcha del servidor de desarrollo.</w:t>
+        <w:t xml:space="preserve">La aplicación web se publica como sitio estático en la plataforma Vercel, en https://graph-sast.vercel.app/. Vercel compila el proyecto a partir del repositorio y sirve los archivos resultantes sin funciones de servidor; se verificó sobre el sitio publicado que el análisis no genera solicitudes hacia otros dominios, de modo que el código analizado no sale del navegador.</w:t>
+      </w:r>
+      <w:r>
+        <w:t xml:space="preserve"> Para el desarrollo local, la ejecución requiere la instalación de las dependencias mediante el gestor de paquetes y la puesta en marcha del servidor de desarrollo.</w:t>
       </w:r>
       <w:r/>
     </w:p>

</xml_diff>